<commit_message>
Aggiornamento del Problem Statement alla 1.2
Revisione sezione 4
</commit_message>
<xml_diff>
--- a/Deliverables/ProblemStatement_Demarcaf.docx
+++ b/Deliverables/ProblemStatement_Demarcaf.docx
@@ -1,6 +1,6 @@
 
 <file path=word/document.xml><?xml version="1.0" encoding="utf-8"?>
-<w:document xmlns:wpc="http://schemas.microsoft.com/office/word/2010/wordprocessingCanvas" xmlns:cx="http://schemas.microsoft.com/office/drawing/2014/chartex" xmlns:cx1="http://schemas.microsoft.com/office/drawing/2015/9/8/chartex" xmlns:cx2="http://schemas.microsoft.com/office/drawing/2015/10/21/chartex" xmlns:cx3="http://schemas.microsoft.com/office/drawing/2016/5/9/chartex" xmlns:cx4="http://schemas.microsoft.com/office/drawing/2016/5/10/chartex" xmlns:cx5="http://schemas.microsoft.com/office/drawing/2016/5/11/chartex" xmlns:cx6="http://schemas.microsoft.com/office/drawing/2016/5/12/chartex" xmlns:cx7="http://schemas.microsoft.com/office/drawing/2016/5/13/chartex" xmlns:cx8="http://schemas.microsoft.com/office/drawing/2016/5/14/chartex" xmlns:mc="http://schemas.openxmlformats.org/markup-compatibility/2006" xmlns:aink="http://schemas.microsoft.com/office/drawing/2016/ink" xmlns:am3d="http://schemas.microsoft.com/office/drawing/2017/model3d" xmlns:o="urn:schemas-microsoft-com:office:office" xmlns:oel="http://schemas.microsoft.com/office/2019/extlst" xmlns:r="http://schemas.openxmlformats.org/officeDocument/2006/relationships" xmlns:m="http://schemas.openxmlformats.org/officeDocument/2006/math" xmlns:v="urn:schemas-microsoft-com:vml" xmlns:wp14="http://schemas.microsoft.com/office/word/2010/wordprocessingDrawing" xmlns:wp="http://schemas.openxmlformats.org/drawingml/2006/wordprocessingDrawing" xmlns:w10="urn:schemas-microsoft-com:office:word" xmlns:w="http://schemas.openxmlformats.org/wordprocessingml/2006/main" xmlns:w14="http://schemas.microsoft.com/office/word/2010/wordml" xmlns:w15="http://schemas.microsoft.com/office/word/2012/wordml" xmlns:w16cex="http://schemas.microsoft.com/office/word/2018/wordml/cex" xmlns:w16cid="http://schemas.microsoft.com/office/word/2016/wordml/cid" xmlns:w16="http://schemas.microsoft.com/office/word/2018/wordml" xmlns:w16du="http://schemas.microsoft.com/office/word/2023/wordml/word16du" xmlns:w16sdtdh="http://schemas.microsoft.com/office/word/2020/wordml/sdtdatahash" xmlns:w16sdtfl="http://schemas.microsoft.com/office/word/2024/wordml/sdtformatlock" xmlns:w16se="http://schemas.microsoft.com/office/word/2015/wordml/symex" xmlns:wpg="http://schemas.microsoft.com/office/word/2010/wordprocessingGroup" xmlns:wpi="http://schemas.microsoft.com/office/word/2010/wordprocessingInk" xmlns:wne="http://schemas.microsoft.com/office/word/2006/wordml" xmlns:wps="http://schemas.microsoft.com/office/word/2010/wordprocessingShape" mc:Ignorable="w14 w15 w16se w16cid w16 w16cex w16sdtdh w16sdtfl w16du wp14">
+<w:document xmlns:wpc="http://schemas.microsoft.com/office/word/2010/wordprocessingCanvas" xmlns:cx="http://schemas.microsoft.com/office/drawing/2014/chartex" xmlns:cx1="http://schemas.microsoft.com/office/drawing/2015/9/8/chartex" xmlns:cx2="http://schemas.microsoft.com/office/drawing/2015/10/21/chartex" xmlns:cx3="http://schemas.microsoft.com/office/drawing/2016/5/9/chartex" xmlns:cx4="http://schemas.microsoft.com/office/drawing/2016/5/10/chartex" xmlns:cx5="http://schemas.microsoft.com/office/drawing/2016/5/11/chartex" xmlns:cx6="http://schemas.microsoft.com/office/drawing/2016/5/12/chartex" xmlns:cx7="http://schemas.microsoft.com/office/drawing/2016/5/13/chartex" xmlns:cx8="http://schemas.microsoft.com/office/drawing/2016/5/14/chartex" xmlns:mc="http://schemas.openxmlformats.org/markup-compatibility/2006" xmlns:aink="http://schemas.microsoft.com/office/drawing/2016/ink" xmlns:am3d="http://schemas.microsoft.com/office/drawing/2017/model3d" xmlns:o="urn:schemas-microsoft-com:office:office" xmlns:r="http://schemas.openxmlformats.org/officeDocument/2006/relationships" xmlns:m="http://schemas.openxmlformats.org/officeDocument/2006/math" xmlns:v="urn:schemas-microsoft-com:vml" xmlns:wp14="http://schemas.microsoft.com/office/word/2010/wordprocessingDrawing" xmlns:wp="http://schemas.openxmlformats.org/drawingml/2006/wordprocessingDrawing" xmlns:w10="urn:schemas-microsoft-com:office:word" xmlns:w="http://schemas.openxmlformats.org/wordprocessingml/2006/main" xmlns:w14="http://schemas.microsoft.com/office/word/2010/wordml" xmlns:w15="http://schemas.microsoft.com/office/word/2012/wordml" xmlns:w16cex="http://schemas.microsoft.com/office/word/2018/wordml/cex" xmlns:w16cid="http://schemas.microsoft.com/office/word/2016/wordml/cid" xmlns:w16="http://schemas.microsoft.com/office/word/2018/wordml" xmlns:w16sdtdh="http://schemas.microsoft.com/office/word/2020/wordml/sdtdatahash" xmlns:w16se="http://schemas.microsoft.com/office/word/2015/wordml/symex" xmlns:wpg="http://schemas.microsoft.com/office/word/2010/wordprocessingGroup" xmlns:wpi="http://schemas.microsoft.com/office/word/2010/wordprocessingInk" xmlns:wne="http://schemas.microsoft.com/office/word/2006/wordml" xmlns:wps="http://schemas.microsoft.com/office/word/2010/wordprocessingShape" mc:Ignorable="w14 w15 w16se w16cid w16 w16cex w16sdtdh wp14">
   <w:body>
     <w:p>
       <w:pPr>
@@ -144,23 +144,28 @@
         <w:ind w:left="10" w:right="85" w:hanging="10"/>
         <w:jc w:val="right"/>
       </w:pPr>
-      <w:proofErr w:type="spellStart"/>
       <w:r>
         <w:rPr>
           <w:rFonts w:ascii="Arial" w:eastAsia="Arial" w:hAnsi="Arial" w:cs="Arial"/>
           <w:b/>
           <w:sz w:val="36"/>
         </w:rPr>
-        <w:t>Demarcaf</w:t>
-      </w:r>
-      <w:proofErr w:type="spellEnd"/>
+        <w:t xml:space="preserve">Demarcaf </w:t>
+      </w:r>
+    </w:p>
+    <w:p>
+      <w:pPr>
+        <w:spacing w:after="0" w:line="259" w:lineRule="auto"/>
+        <w:ind w:left="10" w:right="85" w:hanging="10"/>
+        <w:jc w:val="right"/>
+      </w:pPr>
       <w:r>
         <w:rPr>
           <w:rFonts w:ascii="Arial" w:eastAsia="Arial" w:hAnsi="Arial" w:cs="Arial"/>
           <w:b/>
           <w:sz w:val="36"/>
         </w:rPr>
-        <w:t xml:space="preserve"> </w:t>
+        <w:t xml:space="preserve">Problem Statement </w:t>
       </w:r>
     </w:p>
     <w:p>
@@ -169,38 +174,29 @@
         <w:ind w:left="10" w:right="85" w:hanging="10"/>
         <w:jc w:val="right"/>
       </w:pPr>
-      <w:proofErr w:type="spellStart"/>
       <w:r>
         <w:rPr>
           <w:rFonts w:ascii="Arial" w:eastAsia="Arial" w:hAnsi="Arial" w:cs="Arial"/>
           <w:b/>
           <w:sz w:val="36"/>
         </w:rPr>
-        <w:t>Problem</w:t>
-      </w:r>
-      <w:proofErr w:type="spellEnd"/>
+        <w:t>Versione 1.</w:t>
+      </w:r>
       <w:r>
         <w:rPr>
           <w:rFonts w:ascii="Arial" w:eastAsia="Arial" w:hAnsi="Arial" w:cs="Arial"/>
           <w:b/>
           <w:sz w:val="36"/>
         </w:rPr>
-        <w:t xml:space="preserve"> Statement </w:t>
-      </w:r>
-    </w:p>
-    <w:p>
-      <w:pPr>
-        <w:spacing w:after="0" w:line="259" w:lineRule="auto"/>
-        <w:ind w:left="10" w:right="85" w:hanging="10"/>
-        <w:jc w:val="right"/>
-      </w:pPr>
+        <w:t>2</w:t>
+      </w:r>
       <w:r>
         <w:rPr>
           <w:rFonts w:ascii="Arial" w:eastAsia="Arial" w:hAnsi="Arial" w:cs="Arial"/>
           <w:b/>
           <w:sz w:val="36"/>
         </w:rPr>
-        <w:t xml:space="preserve">Versione 1.1 </w:t>
+        <w:t xml:space="preserve"> </w:t>
       </w:r>
     </w:p>
     <w:p>
@@ -471,7 +467,6 @@
         <w:tblCellMar>
           <w:top w:w="98" w:type="dxa"/>
           <w:left w:w="60" w:type="dxa"/>
-          <w:bottom w:w="0" w:type="dxa"/>
           <w:right w:w="115" w:type="dxa"/>
         </w:tblCellMar>
         <w:tblLook w:val="04A0" w:firstRow="1" w:lastRow="0" w:firstColumn="1" w:lastColumn="0" w:noHBand="0" w:noVBand="1"/>
@@ -504,16 +499,8 @@
                 <w:sz w:val="20"/>
               </w:rPr>
               <w:lastRenderedPageBreak/>
-              <w:t xml:space="preserve">Progetto: </w:t>
-            </w:r>
-            <w:proofErr w:type="spellStart"/>
-            <w:r>
-              <w:rPr>
-                <w:sz w:val="20"/>
-              </w:rPr>
-              <w:t>Demarcaf</w:t>
-            </w:r>
-            <w:proofErr w:type="spellEnd"/>
+              <w:t>Progetto: Demarcaf</w:t>
+            </w:r>
             <w:r>
               <w:rPr>
                 <w:rFonts w:ascii="Arial" w:eastAsia="Arial" w:hAnsi="Arial" w:cs="Arial"/>
@@ -537,12 +524,21 @@
             <w:pPr>
               <w:spacing w:after="0" w:line="259" w:lineRule="auto"/>
               <w:ind w:left="0" w:firstLine="0"/>
+              <w:rPr>
+                <w:sz w:val="20"/>
+              </w:rPr>
             </w:pPr>
             <w:r>
               <w:rPr>
                 <w:sz w:val="20"/>
               </w:rPr>
-              <w:t xml:space="preserve">Versione 1.1 </w:t>
+              <w:t>Versione 1.</w:t>
+            </w:r>
+            <w:r>
+              <w:rPr>
+                <w:sz w:val="20"/>
+              </w:rPr>
+              <w:t>2</w:t>
             </w:r>
           </w:p>
         </w:tc>
@@ -570,16 +566,8 @@
               <w:rPr>
                 <w:sz w:val="20"/>
               </w:rPr>
-              <w:t xml:space="preserve">Documento: </w:t>
-            </w:r>
-            <w:proofErr w:type="spellStart"/>
-            <w:r>
-              <w:rPr>
-                <w:sz w:val="20"/>
-              </w:rPr>
-              <w:t>Problem</w:t>
-            </w:r>
-            <w:proofErr w:type="spellEnd"/>
+              <w:t>Documento: Problem</w:t>
+            </w:r>
             <w:r>
               <w:rPr>
                 <w:b/>
@@ -667,7 +655,6 @@
         <w:tblCellMar>
           <w:top w:w="98" w:type="dxa"/>
           <w:left w:w="60" w:type="dxa"/>
-          <w:bottom w:w="0" w:type="dxa"/>
           <w:right w:w="115" w:type="dxa"/>
         </w:tblCellMar>
         <w:tblLook w:val="04A0" w:firstRow="1" w:lastRow="0" w:firstColumn="1" w:lastColumn="0" w:noHBand="0" w:noVBand="1"/>
@@ -865,7 +852,6 @@
         <w:tblCellMar>
           <w:top w:w="98" w:type="dxa"/>
           <w:left w:w="60" w:type="dxa"/>
-          <w:bottom w:w="0" w:type="dxa"/>
           <w:right w:w="115" w:type="dxa"/>
         </w:tblCellMar>
         <w:tblLook w:val="04A0" w:firstRow="1" w:lastRow="0" w:firstColumn="1" w:lastColumn="0" w:noHBand="0" w:noVBand="1"/>
@@ -1268,7 +1254,6 @@
         <w:tblCellMar>
           <w:top w:w="103" w:type="dxa"/>
           <w:left w:w="60" w:type="dxa"/>
-          <w:bottom w:w="0" w:type="dxa"/>
           <w:right w:w="115" w:type="dxa"/>
         </w:tblCellMar>
         <w:tblLook w:val="04A0" w:firstRow="1" w:lastRow="0" w:firstColumn="1" w:lastColumn="0" w:noHBand="0" w:noVBand="1"/>
@@ -1301,14 +1286,7 @@
                 <w:b/>
                 <w:sz w:val="20"/>
               </w:rPr>
-              <w:t xml:space="preserve"> </w:t>
-            </w:r>
-            <w:r>
-              <w:rPr>
-                <w:b/>
-                <w:sz w:val="20"/>
-              </w:rPr>
-              <w:t xml:space="preserve">Scritto da: </w:t>
+              <w:t xml:space="preserve"> Scritto da: </w:t>
             </w:r>
           </w:p>
         </w:tc>
@@ -1395,23 +1373,13 @@
         <w:ind w:left="0" w:right="3655" w:firstLine="0"/>
         <w:jc w:val="right"/>
       </w:pPr>
-      <w:proofErr w:type="spellStart"/>
       <w:r>
         <w:rPr>
           <w:rFonts w:ascii="Arial" w:eastAsia="Arial" w:hAnsi="Arial" w:cs="Arial"/>
           <w:b/>
           <w:sz w:val="32"/>
         </w:rPr>
-        <w:t>Revision</w:t>
-      </w:r>
-      <w:proofErr w:type="spellEnd"/>
-      <w:r>
-        <w:rPr>
-          <w:rFonts w:ascii="Arial" w:eastAsia="Arial" w:hAnsi="Arial" w:cs="Arial"/>
-          <w:b/>
-          <w:sz w:val="32"/>
-        </w:rPr>
-        <w:t xml:space="preserve"> History </w:t>
+        <w:t xml:space="preserve">Revision History </w:t>
       </w:r>
     </w:p>
     <w:tbl>
@@ -1422,7 +1390,6 @@
         <w:tblCellMar>
           <w:top w:w="98" w:type="dxa"/>
           <w:left w:w="55" w:type="dxa"/>
-          <w:bottom w:w="0" w:type="dxa"/>
           <w:right w:w="58" w:type="dxa"/>
         </w:tblCellMar>
         <w:tblLook w:val="04A0" w:firstRow="1" w:lastRow="0" w:firstColumn="1" w:lastColumn="0" w:noHBand="0" w:noVBand="1"/>
@@ -1950,6 +1917,12 @@
               </w:rPr>
               <w:t xml:space="preserve"> </w:t>
             </w:r>
+            <w:r>
+              <w:rPr>
+                <w:sz w:val="20"/>
+              </w:rPr>
+              <w:t>13/10/2026</w:t>
+            </w:r>
           </w:p>
         </w:tc>
         <w:tc>
@@ -1971,7 +1944,7 @@
               <w:rPr>
                 <w:sz w:val="20"/>
               </w:rPr>
-              <w:t xml:space="preserve"> </w:t>
+              <w:t>1.2</w:t>
             </w:r>
           </w:p>
         </w:tc>
@@ -1988,13 +1961,25 @@
           <w:p>
             <w:pPr>
               <w:spacing w:after="0" w:line="259" w:lineRule="auto"/>
-              <w:ind w:left="716" w:firstLine="0"/>
+              <w:ind w:left="0" w:firstLine="0"/>
+              <w:rPr>
+                <w:sz w:val="20"/>
+                <w:szCs w:val="20"/>
+              </w:rPr>
             </w:pPr>
             <w:r>
               <w:rPr>
                 <w:sz w:val="20"/>
-              </w:rPr>
-              <w:t xml:space="preserve"> </w:t>
+                <w:szCs w:val="20"/>
+              </w:rPr>
+              <w:t>Revisione</w:t>
+            </w:r>
+            <w:r>
+              <w:rPr>
+                <w:sz w:val="20"/>
+                <w:szCs w:val="20"/>
+              </w:rPr>
+              <w:t xml:space="preserve"> Requisiti Non Funzionali</w:t>
             </w:r>
           </w:p>
         </w:tc>
@@ -2017,7 +2002,7 @@
               <w:rPr>
                 <w:sz w:val="20"/>
               </w:rPr>
-              <w:t xml:space="preserve"> </w:t>
+              <w:t>Gianmarco Erra</w:t>
             </w:r>
           </w:p>
         </w:tc>
@@ -2253,8 +2238,6 @@
         <w:tblCellMar>
           <w:top w:w="96" w:type="dxa"/>
           <w:left w:w="60" w:type="dxa"/>
-          <w:bottom w:w="0" w:type="dxa"/>
-          <w:right w:w="0" w:type="dxa"/>
         </w:tblCellMar>
         <w:tblLook w:val="04A0" w:firstRow="1" w:lastRow="0" w:firstColumn="1" w:lastColumn="0" w:noHBand="0" w:noVBand="1"/>
       </w:tblPr>
@@ -2345,6 +2328,17 @@
       <w:pPr>
         <w:spacing w:after="9" w:line="259" w:lineRule="auto"/>
         <w:ind w:left="0" w:firstLine="0"/>
+        <w:rPr>
+          <w:rFonts w:ascii="Arial" w:eastAsia="Arial" w:hAnsi="Arial" w:cs="Arial"/>
+          <w:b/>
+          <w:sz w:val="32"/>
+        </w:rPr>
+      </w:pPr>
+    </w:p>
+    <w:p>
+      <w:pPr>
+        <w:spacing w:after="9" w:line="259" w:lineRule="auto"/>
+        <w:ind w:left="0" w:firstLine="0"/>
       </w:pPr>
       <w:r>
         <w:rPr>
@@ -2386,8 +2380,18 @@
           <w:pPr>
             <w:pStyle w:val="Sommario1"/>
             <w:tabs>
-              <w:tab w:val="right" w:leader="dot" w:pos="9742"/>
+              <w:tab w:val="left" w:pos="440"/>
+              <w:tab w:val="right" w:leader="dot" w:pos="9733"/>
             </w:tabs>
+            <w:rPr>
+              <w:rFonts w:asciiTheme="minorHAnsi" w:eastAsiaTheme="minorEastAsia" w:hAnsiTheme="minorHAnsi" w:cstheme="minorBidi"/>
+              <w:noProof/>
+              <w:color w:val="auto"/>
+              <w:kern w:val="0"/>
+              <w:sz w:val="22"/>
+              <w:szCs w:val="22"/>
+              <w14:ligatures w14:val="none"/>
+            </w:rPr>
           </w:pPr>
           <w:r>
             <w:fldChar w:fldCharType="begin"/>
@@ -2398,26 +2402,80 @@
           <w:r>
             <w:fldChar w:fldCharType="separate"/>
           </w:r>
-          <w:hyperlink w:anchor="_Toc11201">
-            <w:r>
-              <w:t>1. Problem domain</w:t>
-            </w:r>
-            <w:r>
+          <w:hyperlink w:anchor="_Toc242809682" w:history="1">
+            <w:r>
+              <w:rPr>
+                <w:rStyle w:val="Collegamentoipertestuale"/>
+                <w:bCs/>
+                <w:noProof/>
+              </w:rPr>
+              <w:t>1.</w:t>
+            </w:r>
+            <w:r>
+              <w:rPr>
+                <w:rFonts w:asciiTheme="minorHAnsi" w:eastAsiaTheme="minorEastAsia" w:hAnsiTheme="minorHAnsi" w:cstheme="minorBidi"/>
+                <w:noProof/>
+                <w:color w:val="auto"/>
+                <w:kern w:val="0"/>
+                <w:sz w:val="22"/>
+                <w:szCs w:val="22"/>
+                <w14:ligatures w14:val="none"/>
+              </w:rPr>
               <w:tab/>
             </w:r>
             <w:r>
+              <w:rPr>
+                <w:rStyle w:val="Collegamentoipertestuale"/>
+                <w:noProof/>
+              </w:rPr>
+              <w:t>Problem domain</w:t>
+            </w:r>
+            <w:r>
+              <w:rPr>
+                <w:noProof/>
+                <w:webHidden/>
+              </w:rPr>
+              <w:tab/>
+            </w:r>
+            <w:r>
+              <w:rPr>
+                <w:noProof/>
+                <w:webHidden/>
+              </w:rPr>
               <w:fldChar w:fldCharType="begin"/>
             </w:r>
             <w:r>
-              <w:instrText>PAGEREF _Toc11201 \h</w:instrText>
-            </w:r>
-            <w:r>
+              <w:rPr>
+                <w:noProof/>
+                <w:webHidden/>
+              </w:rPr>
+              <w:instrText xml:space="preserve"> PAGEREF _Toc242809682 \h </w:instrText>
+            </w:r>
+            <w:r>
+              <w:rPr>
+                <w:noProof/>
+                <w:webHidden/>
+              </w:rPr>
+            </w:r>
+            <w:r>
+              <w:rPr>
+                <w:noProof/>
+                <w:webHidden/>
+              </w:rPr>
               <w:fldChar w:fldCharType="separate"/>
             </w:r>
             <w:r>
-              <w:t xml:space="preserve">4 </w:t>
-            </w:r>
-            <w:r>
+              <w:rPr>
+                <w:noProof/>
+                <w:webHidden/>
+              </w:rPr>
+              <w:t>4</w:t>
+            </w:r>
+            <w:r>
+              <w:rPr>
+                <w:noProof/>
+                <w:webHidden/>
+              </w:rPr>
               <w:fldChar w:fldCharType="end"/>
             </w:r>
           </w:hyperlink>
@@ -2426,29 +2484,93 @@
           <w:pPr>
             <w:pStyle w:val="Sommario1"/>
             <w:tabs>
-              <w:tab w:val="right" w:leader="dot" w:pos="9742"/>
+              <w:tab w:val="left" w:pos="440"/>
+              <w:tab w:val="right" w:leader="dot" w:pos="9733"/>
             </w:tabs>
+            <w:rPr>
+              <w:rFonts w:asciiTheme="minorHAnsi" w:eastAsiaTheme="minorEastAsia" w:hAnsiTheme="minorHAnsi" w:cstheme="minorBidi"/>
+              <w:noProof/>
+              <w:color w:val="auto"/>
+              <w:kern w:val="0"/>
+              <w:sz w:val="22"/>
+              <w:szCs w:val="22"/>
+              <w14:ligatures w14:val="none"/>
+            </w:rPr>
           </w:pPr>
-          <w:hyperlink w:anchor="_Toc11202">
-            <w:r>
-              <w:t>2. Scenarios</w:t>
-            </w:r>
-            <w:r>
+          <w:hyperlink w:anchor="_Toc242809683" w:history="1">
+            <w:r>
+              <w:rPr>
+                <w:rStyle w:val="Collegamentoipertestuale"/>
+                <w:bCs/>
+                <w:noProof/>
+              </w:rPr>
+              <w:t>2.</w:t>
+            </w:r>
+            <w:r>
+              <w:rPr>
+                <w:rFonts w:asciiTheme="minorHAnsi" w:eastAsiaTheme="minorEastAsia" w:hAnsiTheme="minorHAnsi" w:cstheme="minorBidi"/>
+                <w:noProof/>
+                <w:color w:val="auto"/>
+                <w:kern w:val="0"/>
+                <w:sz w:val="22"/>
+                <w:szCs w:val="22"/>
+                <w14:ligatures w14:val="none"/>
+              </w:rPr>
               <w:tab/>
             </w:r>
             <w:r>
+              <w:rPr>
+                <w:rStyle w:val="Collegamentoipertestuale"/>
+                <w:noProof/>
+              </w:rPr>
+              <w:t>Scenarios</w:t>
+            </w:r>
+            <w:r>
+              <w:rPr>
+                <w:noProof/>
+                <w:webHidden/>
+              </w:rPr>
+              <w:tab/>
+            </w:r>
+            <w:r>
+              <w:rPr>
+                <w:noProof/>
+                <w:webHidden/>
+              </w:rPr>
               <w:fldChar w:fldCharType="begin"/>
             </w:r>
             <w:r>
-              <w:instrText>PAGEREF _Toc11202 \h</w:instrText>
-            </w:r>
-            <w:r>
+              <w:rPr>
+                <w:noProof/>
+                <w:webHidden/>
+              </w:rPr>
+              <w:instrText xml:space="preserve"> PAGEREF _Toc242809683 \h </w:instrText>
+            </w:r>
+            <w:r>
+              <w:rPr>
+                <w:noProof/>
+                <w:webHidden/>
+              </w:rPr>
+            </w:r>
+            <w:r>
+              <w:rPr>
+                <w:noProof/>
+                <w:webHidden/>
+              </w:rPr>
               <w:fldChar w:fldCharType="separate"/>
             </w:r>
             <w:r>
-              <w:t xml:space="preserve">4 </w:t>
-            </w:r>
-            <w:r>
+              <w:rPr>
+                <w:noProof/>
+                <w:webHidden/>
+              </w:rPr>
+              <w:t>4</w:t>
+            </w:r>
+            <w:r>
+              <w:rPr>
+                <w:noProof/>
+                <w:webHidden/>
+              </w:rPr>
               <w:fldChar w:fldCharType="end"/>
             </w:r>
           </w:hyperlink>
@@ -2457,29 +2579,93 @@
           <w:pPr>
             <w:pStyle w:val="Sommario1"/>
             <w:tabs>
-              <w:tab w:val="right" w:leader="dot" w:pos="9742"/>
+              <w:tab w:val="left" w:pos="440"/>
+              <w:tab w:val="right" w:leader="dot" w:pos="9733"/>
             </w:tabs>
+            <w:rPr>
+              <w:rFonts w:asciiTheme="minorHAnsi" w:eastAsiaTheme="minorEastAsia" w:hAnsiTheme="minorHAnsi" w:cstheme="minorBidi"/>
+              <w:noProof/>
+              <w:color w:val="auto"/>
+              <w:kern w:val="0"/>
+              <w:sz w:val="22"/>
+              <w:szCs w:val="22"/>
+              <w14:ligatures w14:val="none"/>
+            </w:rPr>
           </w:pPr>
-          <w:hyperlink w:anchor="_Toc11203">
-            <w:r>
-              <w:t>3. Functional requirements</w:t>
-            </w:r>
-            <w:r>
+          <w:hyperlink w:anchor="_Toc242809684" w:history="1">
+            <w:r>
+              <w:rPr>
+                <w:rStyle w:val="Collegamentoipertestuale"/>
+                <w:bCs/>
+                <w:noProof/>
+              </w:rPr>
+              <w:t>3.</w:t>
+            </w:r>
+            <w:r>
+              <w:rPr>
+                <w:rFonts w:asciiTheme="minorHAnsi" w:eastAsiaTheme="minorEastAsia" w:hAnsiTheme="minorHAnsi" w:cstheme="minorBidi"/>
+                <w:noProof/>
+                <w:color w:val="auto"/>
+                <w:kern w:val="0"/>
+                <w:sz w:val="22"/>
+                <w:szCs w:val="22"/>
+                <w14:ligatures w14:val="none"/>
+              </w:rPr>
               <w:tab/>
             </w:r>
             <w:r>
+              <w:rPr>
+                <w:rStyle w:val="Collegamentoipertestuale"/>
+                <w:noProof/>
+              </w:rPr>
+              <w:t>Functional requirements</w:t>
+            </w:r>
+            <w:r>
+              <w:rPr>
+                <w:noProof/>
+                <w:webHidden/>
+              </w:rPr>
+              <w:tab/>
+            </w:r>
+            <w:r>
+              <w:rPr>
+                <w:noProof/>
+                <w:webHidden/>
+              </w:rPr>
               <w:fldChar w:fldCharType="begin"/>
             </w:r>
             <w:r>
-              <w:instrText>PAGEREF _Toc11203 \h</w:instrText>
-            </w:r>
-            <w:r>
+              <w:rPr>
+                <w:noProof/>
+                <w:webHidden/>
+              </w:rPr>
+              <w:instrText xml:space="preserve"> PAGEREF _Toc242809684 \h </w:instrText>
+            </w:r>
+            <w:r>
+              <w:rPr>
+                <w:noProof/>
+                <w:webHidden/>
+              </w:rPr>
+            </w:r>
+            <w:r>
+              <w:rPr>
+                <w:noProof/>
+                <w:webHidden/>
+              </w:rPr>
               <w:fldChar w:fldCharType="separate"/>
             </w:r>
             <w:r>
-              <w:t xml:space="preserve">5 </w:t>
-            </w:r>
-            <w:r>
+              <w:rPr>
+                <w:noProof/>
+                <w:webHidden/>
+              </w:rPr>
+              <w:t>5</w:t>
+            </w:r>
+            <w:r>
+              <w:rPr>
+                <w:noProof/>
+                <w:webHidden/>
+              </w:rPr>
               <w:fldChar w:fldCharType="end"/>
             </w:r>
           </w:hyperlink>
@@ -2488,29 +2674,93 @@
           <w:pPr>
             <w:pStyle w:val="Sommario1"/>
             <w:tabs>
-              <w:tab w:val="right" w:leader="dot" w:pos="9742"/>
+              <w:tab w:val="left" w:pos="440"/>
+              <w:tab w:val="right" w:leader="dot" w:pos="9733"/>
             </w:tabs>
+            <w:rPr>
+              <w:rFonts w:asciiTheme="minorHAnsi" w:eastAsiaTheme="minorEastAsia" w:hAnsiTheme="minorHAnsi" w:cstheme="minorBidi"/>
+              <w:noProof/>
+              <w:color w:val="auto"/>
+              <w:kern w:val="0"/>
+              <w:sz w:val="22"/>
+              <w:szCs w:val="22"/>
+              <w14:ligatures w14:val="none"/>
+            </w:rPr>
           </w:pPr>
-          <w:hyperlink w:anchor="_Toc11204">
-            <w:r>
-              <w:t>4. Nonfunctional requirements</w:t>
-            </w:r>
-            <w:r>
+          <w:hyperlink w:anchor="_Toc242809685" w:history="1">
+            <w:r>
+              <w:rPr>
+                <w:rStyle w:val="Collegamentoipertestuale"/>
+                <w:bCs/>
+                <w:noProof/>
+              </w:rPr>
+              <w:t>4.</w:t>
+            </w:r>
+            <w:r>
+              <w:rPr>
+                <w:rFonts w:asciiTheme="minorHAnsi" w:eastAsiaTheme="minorEastAsia" w:hAnsiTheme="minorHAnsi" w:cstheme="minorBidi"/>
+                <w:noProof/>
+                <w:color w:val="auto"/>
+                <w:kern w:val="0"/>
+                <w:sz w:val="22"/>
+                <w:szCs w:val="22"/>
+                <w14:ligatures w14:val="none"/>
+              </w:rPr>
               <w:tab/>
             </w:r>
             <w:r>
+              <w:rPr>
+                <w:rStyle w:val="Collegamentoipertestuale"/>
+                <w:noProof/>
+              </w:rPr>
+              <w:t>Nonfunctional requirements</w:t>
+            </w:r>
+            <w:r>
+              <w:rPr>
+                <w:noProof/>
+                <w:webHidden/>
+              </w:rPr>
+              <w:tab/>
+            </w:r>
+            <w:r>
+              <w:rPr>
+                <w:noProof/>
+                <w:webHidden/>
+              </w:rPr>
               <w:fldChar w:fldCharType="begin"/>
             </w:r>
             <w:r>
-              <w:instrText>PAGEREF _Toc11204 \h</w:instrText>
-            </w:r>
-            <w:r>
+              <w:rPr>
+                <w:noProof/>
+                <w:webHidden/>
+              </w:rPr>
+              <w:instrText xml:space="preserve"> PAGEREF _Toc242809685 \h </w:instrText>
+            </w:r>
+            <w:r>
+              <w:rPr>
+                <w:noProof/>
+                <w:webHidden/>
+              </w:rPr>
+            </w:r>
+            <w:r>
+              <w:rPr>
+                <w:noProof/>
+                <w:webHidden/>
+              </w:rPr>
               <w:fldChar w:fldCharType="separate"/>
             </w:r>
             <w:r>
-              <w:t xml:space="preserve">7 </w:t>
-            </w:r>
-            <w:r>
+              <w:rPr>
+                <w:noProof/>
+                <w:webHidden/>
+              </w:rPr>
+              <w:t>7</w:t>
+            </w:r>
+            <w:r>
+              <w:rPr>
+                <w:noProof/>
+                <w:webHidden/>
+              </w:rPr>
               <w:fldChar w:fldCharType="end"/>
             </w:r>
           </w:hyperlink>
@@ -2519,29 +2769,93 @@
           <w:pPr>
             <w:pStyle w:val="Sommario1"/>
             <w:tabs>
-              <w:tab w:val="right" w:leader="dot" w:pos="9742"/>
+              <w:tab w:val="left" w:pos="440"/>
+              <w:tab w:val="right" w:leader="dot" w:pos="9733"/>
             </w:tabs>
+            <w:rPr>
+              <w:rFonts w:asciiTheme="minorHAnsi" w:eastAsiaTheme="minorEastAsia" w:hAnsiTheme="minorHAnsi" w:cstheme="minorBidi"/>
+              <w:noProof/>
+              <w:color w:val="auto"/>
+              <w:kern w:val="0"/>
+              <w:sz w:val="22"/>
+              <w:szCs w:val="22"/>
+              <w14:ligatures w14:val="none"/>
+            </w:rPr>
           </w:pPr>
-          <w:hyperlink w:anchor="_Toc11205">
-            <w:r>
-              <w:t>5. Target environment</w:t>
-            </w:r>
-            <w:r>
+          <w:hyperlink w:anchor="_Toc242809686" w:history="1">
+            <w:r>
+              <w:rPr>
+                <w:rStyle w:val="Collegamentoipertestuale"/>
+                <w:bCs/>
+                <w:noProof/>
+              </w:rPr>
+              <w:t>5.</w:t>
+            </w:r>
+            <w:r>
+              <w:rPr>
+                <w:rFonts w:asciiTheme="minorHAnsi" w:eastAsiaTheme="minorEastAsia" w:hAnsiTheme="minorHAnsi" w:cstheme="minorBidi"/>
+                <w:noProof/>
+                <w:color w:val="auto"/>
+                <w:kern w:val="0"/>
+                <w:sz w:val="22"/>
+                <w:szCs w:val="22"/>
+                <w14:ligatures w14:val="none"/>
+              </w:rPr>
               <w:tab/>
             </w:r>
             <w:r>
+              <w:rPr>
+                <w:rStyle w:val="Collegamentoipertestuale"/>
+                <w:noProof/>
+              </w:rPr>
+              <w:t>Target environment</w:t>
+            </w:r>
+            <w:r>
+              <w:rPr>
+                <w:noProof/>
+                <w:webHidden/>
+              </w:rPr>
+              <w:tab/>
+            </w:r>
+            <w:r>
+              <w:rPr>
+                <w:noProof/>
+                <w:webHidden/>
+              </w:rPr>
               <w:fldChar w:fldCharType="begin"/>
             </w:r>
             <w:r>
-              <w:instrText>PAGEREF _Toc11205 \h</w:instrText>
-            </w:r>
-            <w:r>
+              <w:rPr>
+                <w:noProof/>
+                <w:webHidden/>
+              </w:rPr>
+              <w:instrText xml:space="preserve"> PAGEREF _Toc242809686 \h </w:instrText>
+            </w:r>
+            <w:r>
+              <w:rPr>
+                <w:noProof/>
+                <w:webHidden/>
+              </w:rPr>
+            </w:r>
+            <w:r>
+              <w:rPr>
+                <w:noProof/>
+                <w:webHidden/>
+              </w:rPr>
               <w:fldChar w:fldCharType="separate"/>
             </w:r>
             <w:r>
-              <w:t xml:space="preserve">7 </w:t>
-            </w:r>
-            <w:r>
+              <w:rPr>
+                <w:noProof/>
+                <w:webHidden/>
+              </w:rPr>
+              <w:t>8</w:t>
+            </w:r>
+            <w:r>
+              <w:rPr>
+                <w:noProof/>
+                <w:webHidden/>
+              </w:rPr>
               <w:fldChar w:fldCharType="end"/>
             </w:r>
           </w:hyperlink>
@@ -2550,32 +2864,86 @@
           <w:pPr>
             <w:pStyle w:val="Sommario1"/>
             <w:tabs>
-              <w:tab w:val="right" w:leader="dot" w:pos="9742"/>
+              <w:tab w:val="right" w:leader="dot" w:pos="9733"/>
             </w:tabs>
+            <w:rPr>
+              <w:rFonts w:asciiTheme="minorHAnsi" w:eastAsiaTheme="minorEastAsia" w:hAnsiTheme="minorHAnsi" w:cstheme="minorBidi"/>
+              <w:noProof/>
+              <w:color w:val="auto"/>
+              <w:kern w:val="0"/>
+              <w:sz w:val="22"/>
+              <w:szCs w:val="22"/>
+              <w14:ligatures w14:val="none"/>
+            </w:rPr>
           </w:pPr>
-          <w:hyperlink w:anchor="_Toc11206">
-            <w:r>
-              <w:t xml:space="preserve">6. </w:t>
-            </w:r>
-            <w:r>
+          <w:hyperlink w:anchor="_Toc242809687" w:history="1">
+            <w:r>
+              <w:rPr>
+                <w:rStyle w:val="Collegamentoipertestuale"/>
+                <w:noProof/>
+              </w:rPr>
+              <w:t>6.</w:t>
+            </w:r>
+            <w:r>
+              <w:rPr>
+                <w:rStyle w:val="Collegamentoipertestuale"/>
+                <w:noProof/>
+              </w:rPr>
+              <w:t xml:space="preserve">    </w:t>
+            </w:r>
+            <w:r>
+              <w:rPr>
+                <w:rStyle w:val="Collegamentoipertestuale"/>
+                <w:noProof/>
+              </w:rPr>
               <w:t>Deliverable &amp; deadlines</w:t>
             </w:r>
             <w:r>
+              <w:rPr>
+                <w:noProof/>
+                <w:webHidden/>
+              </w:rPr>
               <w:tab/>
             </w:r>
             <w:r>
+              <w:rPr>
+                <w:noProof/>
+                <w:webHidden/>
+              </w:rPr>
               <w:fldChar w:fldCharType="begin"/>
             </w:r>
             <w:r>
-              <w:instrText>PAGEREF _Toc11206 \h</w:instrText>
-            </w:r>
-            <w:r>
+              <w:rPr>
+                <w:noProof/>
+                <w:webHidden/>
+              </w:rPr>
+              <w:instrText xml:space="preserve"> PAGEREF _Toc242809687 \h </w:instrText>
+            </w:r>
+            <w:r>
+              <w:rPr>
+                <w:noProof/>
+                <w:webHidden/>
+              </w:rPr>
+            </w:r>
+            <w:r>
+              <w:rPr>
+                <w:noProof/>
+                <w:webHidden/>
+              </w:rPr>
               <w:fldChar w:fldCharType="separate"/>
             </w:r>
             <w:r>
-              <w:t xml:space="preserve">8 </w:t>
-            </w:r>
-            <w:r>
+              <w:rPr>
+                <w:noProof/>
+                <w:webHidden/>
+              </w:rPr>
+              <w:t>8</w:t>
+            </w:r>
+            <w:r>
+              <w:rPr>
+                <w:noProof/>
+                <w:webHidden/>
+              </w:rPr>
               <w:fldChar w:fldCharType="end"/>
             </w:r>
           </w:hyperlink>
@@ -2926,6 +3294,7 @@
         <w:ind w:left="1133" w:firstLine="0"/>
       </w:pPr>
       <w:r>
+        <w:lastRenderedPageBreak/>
         <w:t xml:space="preserve"> </w:t>
       </w:r>
     </w:p>
@@ -2935,7 +3304,6 @@
         <w:ind w:left="0" w:firstLine="0"/>
       </w:pPr>
       <w:r>
-        <w:lastRenderedPageBreak/>
         <w:t xml:space="preserve"> </w:t>
       </w:r>
     </w:p>
@@ -2944,16 +3312,14 @@
         <w:pStyle w:val="Titolo1"/>
         <w:ind w:left="711" w:hanging="351"/>
       </w:pPr>
-      <w:bookmarkStart w:id="0" w:name="_Toc11201"/>
-      <w:proofErr w:type="spellStart"/>
-      <w:r>
-        <w:t>Problem</w:t>
-      </w:r>
-      <w:proofErr w:type="spellEnd"/>
-      <w:r>
-        <w:t xml:space="preserve"> domain </w:t>
+      <w:bookmarkStart w:id="0" w:name="_Toc242809682"/>
+      <w:r>
+        <w:t>Problem domain</w:t>
       </w:r>
       <w:bookmarkEnd w:id="0"/>
+      <w:r>
+        <w:t xml:space="preserve"> </w:t>
+      </w:r>
     </w:p>
     <w:p>
       <w:pPr>
@@ -2969,10 +3335,7 @@
         <w:ind w:left="0" w:right="75" w:firstLine="0"/>
       </w:pPr>
       <w:r>
-        <w:t xml:space="preserve">Il settore della distribuzione di prodotti legati al caffè (cialde, capsule, caffè in grani, macchine da caffè e accessori) e dei relativi servizi di manutenzione tecnica è tradizionalmente gestito attraverso canali frammentati. </w:t>
-      </w:r>
-      <w:r>
-        <w:t xml:space="preserve">Da un lato, la vendita al dettaglio e all'ingrosso richiede un aggiornamento costante delle disponibilità di magazzino e dei listini; dall'altro, la gestione dell'assistenza tecnica e delle riparazioni per le macchine da caffè (sia per clienti privati che per attività commerciali) avviene spesso tramite contatti telefonici o annotazioni manuali. </w:t>
+        <w:t xml:space="preserve">Il settore della distribuzione di prodotti legati al caffè (cialde, capsule, caffè in grani, macchine da caffè e accessori) e dei relativi servizi di manutenzione tecnica è tradizionalmente gestito attraverso canali frammentati. Da un lato, la vendita al dettaglio e all'ingrosso richiede un aggiornamento costante delle disponibilità di magazzino e dei listini; dall'altro, la gestione dell'assistenza tecnica e delle riparazioni per le macchine da caffè (sia per clienti privati che per attività commerciali) avviene spesso tramite contatti telefonici o annotazioni manuali. </w:t>
       </w:r>
     </w:p>
     <w:p>
@@ -2980,10 +3343,7 @@
         <w:ind w:left="0" w:right="75" w:firstLine="0"/>
       </w:pPr>
       <w:r>
-        <w:t xml:space="preserve">Questa mancanza di integrazione comporta diverse criticità: difficoltà per i clienti nel verificare la disponibilità immediata dei prodotti, tempi di attesa </w:t>
-      </w:r>
-      <w:r>
-        <w:t xml:space="preserve">prolungati per richiedere un intervento di manutenzione, assenza di tracciabilità sullo stato delle riparazioni in corso e inefficienze nell'organizzazione del lavoro dei tecnici. </w:t>
+        <w:t xml:space="preserve">Questa mancanza di integrazione comporta diverse criticità: difficoltà per i clienti nel verificare la disponibilità immediata dei prodotti, tempi di attesa prolungati per richiedere un intervento di manutenzione, assenza di tracciabilità sullo stato delle riparazioni in corso e inefficienze nell'organizzazione del lavoro dei tecnici. </w:t>
       </w:r>
     </w:p>
     <w:p>
@@ -2994,27 +3354,14 @@
       <w:r>
         <w:t xml:space="preserve">Il progetto </w:t>
       </w:r>
-      <w:proofErr w:type="spellStart"/>
       <w:r>
         <w:rPr>
           <w:b/>
         </w:rPr>
         <w:t>Demarcaf</w:t>
       </w:r>
-      <w:proofErr w:type="spellEnd"/>
-      <w:r>
-        <w:t xml:space="preserve"> nasce con l'obiettivo di risolvere queste problematiche attraverso la realizzazione di una piattaforma software unificata. Il sistema combinerà le funzionalità di un portale e-</w:t>
-      </w:r>
-      <w:r>
-        <w:t xml:space="preserve">commerce per l'acquisto di prodotti del settore caffè con un sistema gestionale strutturato per la prenotazione, l'assegnazione e il monitoraggio degli interventi di assistenza tecnica sulle macchine da caffè, garantendo efficienza operativa, trasparenza per l'utente finale e </w:t>
-      </w:r>
-      <w:proofErr w:type="gramStart"/>
-      <w:r>
-        <w:t>centralizzazione  dei</w:t>
-      </w:r>
-      <w:proofErr w:type="gramEnd"/>
-      <w:r>
-        <w:t xml:space="preserve"> dati aziendali. </w:t>
+      <w:r>
+        <w:t xml:space="preserve"> nasce con l'obiettivo di risolvere queste problematiche attraverso la realizzazione di una piattaforma software unificata. Il sistema combinerà le funzionalità di un portale e-commerce per l'acquisto di prodotti del settore caffè con un sistema gestionale strutturato per la prenotazione, l'assegnazione e il monitoraggio degli interventi di assistenza tecnica sulle macchine da caffè, garantendo efficienza operativa, trasparenza per l'utente finale e centralizzazione  dei dati aziendali. </w:t>
       </w:r>
     </w:p>
     <w:p>
@@ -3022,16 +3369,14 @@
         <w:pStyle w:val="Titolo1"/>
         <w:ind w:left="307" w:hanging="322"/>
       </w:pPr>
-      <w:bookmarkStart w:id="1" w:name="_Toc11202"/>
-      <w:proofErr w:type="spellStart"/>
+      <w:bookmarkStart w:id="1" w:name="_Toc242809683"/>
       <w:r>
         <w:t>Scenarios</w:t>
       </w:r>
-      <w:proofErr w:type="spellEnd"/>
-      <w:r>
-        <w:t xml:space="preserve"> </w:t>
-      </w:r>
       <w:bookmarkEnd w:id="1"/>
+      <w:r>
+        <w:t xml:space="preserve"> </w:t>
+      </w:r>
     </w:p>
     <w:p>
       <w:pPr>
@@ -3047,15 +3392,7 @@
         <w:ind w:left="0" w:right="75" w:firstLine="0"/>
       </w:pPr>
       <w:r>
-        <w:t xml:space="preserve">Di seguito vengono descritti i principali scenari operativi che illustrano l'utilizzo del sistema </w:t>
-      </w:r>
-      <w:proofErr w:type="spellStart"/>
-      <w:r>
-        <w:t>Demarcaf</w:t>
-      </w:r>
-      <w:proofErr w:type="spellEnd"/>
-      <w:r>
-        <w:t xml:space="preserve"> da parte di attori concreti per le operazioni fondamentali. </w:t>
+        <w:t xml:space="preserve">Di seguito vengono descritti i principali scenari operativi che illustrano l'utilizzo del sistema Demarcaf da parte di attori concreti per le operazioni fondamentali. </w:t>
       </w:r>
     </w:p>
     <w:p>
@@ -3094,15 +3431,7 @@
         <w:ind w:right="75" w:hanging="360"/>
       </w:pPr>
       <w:r>
-        <w:t xml:space="preserve">Mario, un cliente abituale, si accorge di aver esaurito la scorta di caffè a casa. Accede alla piattaforma </w:t>
-      </w:r>
-      <w:proofErr w:type="spellStart"/>
-      <w:r>
-        <w:t>Demarcaf</w:t>
-      </w:r>
-      <w:proofErr w:type="spellEnd"/>
-      <w:r>
-        <w:t xml:space="preserve"> dal suo laptop per acquistare nuove capsule. </w:t>
+        <w:t xml:space="preserve">Mario, un cliente abituale, si accorge di aver esaurito la scorta di caffè a casa. Accede alla piattaforma Demarcaf dal suo laptop per acquistare nuove capsule. </w:t>
       </w:r>
     </w:p>
     <w:p>
@@ -3186,37 +3515,13 @@
         <w:ind w:right="75" w:hanging="360"/>
       </w:pPr>
       <w:r>
-        <w:t xml:space="preserve">Luigi, proprietario del "Bar Verdi", </w:t>
-      </w:r>
-      <w:proofErr w:type="spellStart"/>
-      <w:r>
-        <w:t>riscontra</w:t>
-      </w:r>
-      <w:proofErr w:type="spellEnd"/>
-      <w:r>
-        <w:t xml:space="preserve"> un'improvvisa perdita di pressione nella sua macchina da caffè commerciale (modello </w:t>
-      </w:r>
-      <w:proofErr w:type="spellStart"/>
-      <w:proofErr w:type="gramStart"/>
+        <w:t xml:space="preserve">Luigi, proprietario del "Bar Verdi", riscontra un'improvvisa perdita di pressione nella sua macchina da caffè commerciale (modello </w:t>
+      </w:r>
       <w:r>
         <w:rPr>
           <w:i/>
         </w:rPr>
-        <w:t>Fiorenzato</w:t>
-      </w:r>
-      <w:proofErr w:type="spellEnd"/>
-      <w:r>
-        <w:rPr>
-          <w:i/>
-        </w:rPr>
-        <w:t xml:space="preserve"> ,</w:t>
-      </w:r>
-      <w:proofErr w:type="gramEnd"/>
-      <w:r>
-        <w:rPr>
-          <w:i/>
-        </w:rPr>
-        <w:t xml:space="preserve"> San Marco</w:t>
+        <w:t>Fiorenzato , San Marco</w:t>
       </w:r>
       <w:r>
         <w:t xml:space="preserve"> a leva) durante il turno mattutino. </w:t>
@@ -3231,15 +3536,7 @@
         <w:ind w:right="75" w:hanging="360"/>
       </w:pPr>
       <w:r>
-        <w:t xml:space="preserve">Essendo una situazione critica, Luigi accede alla piattaforma </w:t>
-      </w:r>
-      <w:proofErr w:type="spellStart"/>
-      <w:r>
-        <w:t>Demarcaf</w:t>
-      </w:r>
-      <w:proofErr w:type="spellEnd"/>
-      <w:r>
-        <w:t xml:space="preserve"> tramite smartphone ed entra nell'area "Assistenza Tecnica". </w:t>
+        <w:t xml:space="preserve">Essendo una situazione critica, Luigi accede alla piattaforma Demarcaf tramite smartphone ed entra nell'area "Assistenza Tecnica". </w:t>
       </w:r>
     </w:p>
     <w:p>
@@ -3253,19 +3550,11 @@
       <w:r>
         <w:t>Compila il modulo per l'apertura di un ticket: inserisce il modello esatto della macchina (</w:t>
       </w:r>
-      <w:proofErr w:type="spellStart"/>
       <w:r>
         <w:rPr>
           <w:i/>
         </w:rPr>
-        <w:t>Fiorenzato</w:t>
-      </w:r>
-      <w:proofErr w:type="spellEnd"/>
-      <w:r>
-        <w:rPr>
-          <w:i/>
-        </w:rPr>
-        <w:t xml:space="preserve"> San Marco</w:t>
+        <w:t>Fiorenzato San Marco</w:t>
       </w:r>
       <w:r>
         <w:t xml:space="preserve">), descrive il guasto ("Perdita di pressione dal gruppo erogatore destro") e spunta l'opzione di urgenza per blocco macchina. </w:t>
@@ -3289,6 +3578,7 @@
         <w:ind w:left="720" w:firstLine="0"/>
       </w:pPr>
       <w:r>
+        <w:lastRenderedPageBreak/>
         <w:t xml:space="preserve"> </w:t>
       </w:r>
     </w:p>
@@ -3298,7 +3588,6 @@
         <w:ind w:left="-5"/>
       </w:pPr>
       <w:r>
-        <w:lastRenderedPageBreak/>
         <w:t>Scenario 3: Presa in carico e gestione della riparazione (Attore: Antonio, Tecnico)</w:t>
       </w:r>
       <w:r>
@@ -3317,15 +3606,7 @@
         <w:ind w:right="75" w:hanging="360"/>
       </w:pPr>
       <w:r>
-        <w:t xml:space="preserve">Antonio, tecnico specializzato di </w:t>
-      </w:r>
-      <w:proofErr w:type="spellStart"/>
-      <w:r>
-        <w:t>Demarcaf</w:t>
-      </w:r>
-      <w:proofErr w:type="spellEnd"/>
-      <w:r>
-        <w:t xml:space="preserve">, riceve una notifica sul suo tablet e accede alla dashboard tecnica del sistema. </w:t>
+        <w:t xml:space="preserve">Antonio, tecnico specializzato di Demarcaf, riceve una notifica sul suo tablet e accede alla dashboard tecnica del sistema. </w:t>
       </w:r>
     </w:p>
     <w:p>
@@ -3339,14 +3620,12 @@
       <w:r>
         <w:t xml:space="preserve">Visualizza la coda dei ticket e nota in cima la richiesta urgente #TKT-1042 inoltrata da Luigi. Antonio clicca sul ticket, legge i dettagli sulla perdita di pressione della </w:t>
       </w:r>
-      <w:proofErr w:type="spellStart"/>
       <w:r>
         <w:rPr>
           <w:i/>
         </w:rPr>
         <w:t>Fiorenzato</w:t>
       </w:r>
-      <w:proofErr w:type="spellEnd"/>
       <w:r>
         <w:t xml:space="preserve"> e clicca su "Prendi in carico". Il sistema aggiorna automaticamente lo stato in "In lavorazione". </w:t>
       </w:r>
@@ -3372,15 +3651,7 @@
         <w:ind w:right="75" w:hanging="360"/>
       </w:pPr>
       <w:r>
-        <w:t xml:space="preserve">Inserisce la nota di servizio ("Sostituzione guarnizione gruppo a leva destro, test pressione superato") e cambia lo stato del ticket in "Completato". Il sistema invia in automatico </w:t>
-      </w:r>
-      <w:proofErr w:type="gramStart"/>
-      <w:r>
-        <w:t>un'email</w:t>
-      </w:r>
-      <w:proofErr w:type="gramEnd"/>
-      <w:r>
-        <w:t xml:space="preserve"> a Luigi per notificargli la risoluzione del guasto. </w:t>
+        <w:t xml:space="preserve">Inserisce la nota di servizio ("Sostituzione guarnizione gruppo a leva destro, test pressione superato") e cambia lo stato del ticket in "Completato". Il sistema invia in automatico un'email a Luigi per notificargli la risoluzione del guasto. </w:t>
       </w:r>
     </w:p>
     <w:p>
@@ -3416,15 +3687,7 @@
         <w:ind w:right="75" w:hanging="360"/>
       </w:pPr>
       <w:r>
-        <w:t xml:space="preserve">Gianmarco, l'amministratore del sistema, accede al pannello di back-office di </w:t>
-      </w:r>
-      <w:proofErr w:type="spellStart"/>
-      <w:r>
-        <w:t>Demarcaf</w:t>
-      </w:r>
-      <w:proofErr w:type="spellEnd"/>
-      <w:r>
-        <w:t xml:space="preserve"> con le sue credenziali private perché è appena arrivato un nuovo carico di macchine da caffè in magazzino. </w:t>
+        <w:t xml:space="preserve">Gianmarco, l'amministratore del sistema, accede al pannello di back-office di Demarcaf con le sue credenziali private perché è appena arrivato un nuovo carico di macchine da caffè in magazzino. </w:t>
       </w:r>
     </w:p>
     <w:p>
@@ -3436,13 +3699,7 @@
         <w:ind w:right="75" w:hanging="360"/>
       </w:pPr>
       <w:r>
-        <w:t xml:space="preserve">Seleziona la funzione "Aggiungi nuovo prodotto", inserisce il nome (es. "Macchina </w:t>
-      </w:r>
-      <w:r>
-        <w:t xml:space="preserve">Espresso Lollo"), carica due fotografie del prodotto, imposta il prezzo di vendita a 120€ e la </w:t>
-      </w:r>
-      <w:r>
-        <w:t xml:space="preserve">quantità disponibile a 20 unità. </w:t>
+        <w:t xml:space="preserve">Seleziona la funzione "Aggiungi nuovo prodotto", inserisce il nome (es. "Macchina Espresso Lollo"), carica due fotografie del prodotto, imposta il prezzo di vendita a 120€ e la quantità disponibile a 20 unità. </w:t>
       </w:r>
     </w:p>
     <w:p>
@@ -3482,24 +3739,14 @@
         <w:spacing w:after="190"/>
         <w:ind w:left="302" w:hanging="317"/>
       </w:pPr>
-      <w:bookmarkStart w:id="2" w:name="_Toc11203"/>
-      <w:proofErr w:type="spellStart"/>
-      <w:r>
-        <w:t>Functional</w:t>
-      </w:r>
-      <w:proofErr w:type="spellEnd"/>
-      <w:r>
-        <w:t xml:space="preserve"> </w:t>
-      </w:r>
-      <w:proofErr w:type="spellStart"/>
-      <w:r>
-        <w:t>requirements</w:t>
-      </w:r>
-      <w:proofErr w:type="spellEnd"/>
-      <w:r>
-        <w:t xml:space="preserve"> </w:t>
+      <w:bookmarkStart w:id="2" w:name="_Toc242809684"/>
+      <w:r>
+        <w:t>Functional requirements</w:t>
       </w:r>
       <w:bookmarkEnd w:id="2"/>
+      <w:r>
+        <w:t xml:space="preserve"> </w:t>
+      </w:r>
     </w:p>
     <w:p>
       <w:pPr>
@@ -3507,23 +3754,7 @@
         <w:ind w:left="0" w:right="75" w:firstLine="0"/>
       </w:pPr>
       <w:r>
-        <w:t xml:space="preserve">Il sistema </w:t>
-      </w:r>
-      <w:proofErr w:type="spellStart"/>
-      <w:r>
-        <w:t>Demarcaf</w:t>
-      </w:r>
-      <w:proofErr w:type="spellEnd"/>
-      <w:r>
-        <w:t xml:space="preserve"> dovrà supportare i seguenti requisiti funzionali, suddivisi per </w:t>
-      </w:r>
-      <w:proofErr w:type="gramStart"/>
-      <w:r>
-        <w:t>macro-aree</w:t>
-      </w:r>
-      <w:proofErr w:type="gramEnd"/>
-      <w:r>
-        <w:t xml:space="preserve">: </w:t>
+        <w:t xml:space="preserve">Il sistema Demarcaf dovrà supportare i seguenti requisiti funzionali, suddivisi per macro-aree: </w:t>
       </w:r>
     </w:p>
     <w:p>
@@ -3647,6 +3878,7 @@
         <w:ind w:right="75" w:hanging="360"/>
       </w:pPr>
       <w:r>
+        <w:lastRenderedPageBreak/>
         <w:t xml:space="preserve">Il sistema deve permettere all'utente di filtrare i risultati della ricerca per categoria e per fascia di prezzo. </w:t>
       </w:r>
     </w:p>
@@ -3657,7 +3889,6 @@
         <w:ind w:left="-5"/>
       </w:pPr>
       <w:r>
-        <w:lastRenderedPageBreak/>
         <w:t xml:space="preserve">Carrello e Gestione Ordini </w:t>
       </w:r>
     </w:p>
@@ -3872,16 +4103,14 @@
         <w:ind w:right="75" w:hanging="360"/>
       </w:pPr>
       <w:r>
-        <w:t xml:space="preserve">Il sistema deve consentire all'amministratore di filtrare gli ordini ricevuti per intervallo di date e per indirizzo </w:t>
-      </w:r>
-      <w:proofErr w:type="gramStart"/>
-      <w:r>
-        <w:t>email</w:t>
-      </w:r>
-      <w:proofErr w:type="gramEnd"/>
-      <w:r>
-        <w:t xml:space="preserve"> del cliente. </w:t>
-      </w:r>
+        <w:t xml:space="preserve">Il sistema deve consentire all'amministratore di filtrare gli ordini ricevuti per intervallo di date e per indirizzo email del cliente. </w:t>
+      </w:r>
+    </w:p>
+    <w:p>
+      <w:pPr>
+        <w:spacing w:after="366"/>
+        <w:ind w:left="0" w:right="75" w:firstLine="0"/>
+      </w:pPr>
     </w:p>
     <w:p>
       <w:pPr>
@@ -3902,183 +4131,335 @@
         <w:pStyle w:val="Titolo1"/>
         <w:ind w:left="306" w:hanging="321"/>
       </w:pPr>
-      <w:bookmarkStart w:id="3" w:name="_Toc11204"/>
-      <w:proofErr w:type="spellStart"/>
-      <w:r>
-        <w:t>Nonfunctional</w:t>
-      </w:r>
-      <w:proofErr w:type="spellEnd"/>
-      <w:r>
-        <w:t xml:space="preserve"> </w:t>
-      </w:r>
-      <w:proofErr w:type="spellStart"/>
-      <w:r>
-        <w:t>requirements</w:t>
-      </w:r>
-      <w:proofErr w:type="spellEnd"/>
-      <w:r>
-        <w:t xml:space="preserve"> </w:t>
+      <w:bookmarkStart w:id="3" w:name="_Toc242809685"/>
+      <w:r>
+        <w:lastRenderedPageBreak/>
+        <w:t>Nonfunctional requirements</w:t>
       </w:r>
       <w:bookmarkEnd w:id="3"/>
+      <w:r>
+        <w:t xml:space="preserve"> </w:t>
+      </w:r>
     </w:p>
     <w:p>
       <w:pPr>
         <w:spacing w:after="0" w:line="259" w:lineRule="auto"/>
         <w:ind w:left="0" w:firstLine="0"/>
       </w:pPr>
-      <w:r>
-        <w:t xml:space="preserve"> </w:t>
-      </w:r>
-    </w:p>
-    <w:p>
-      <w:pPr>
-        <w:ind w:left="0" w:right="75" w:firstLine="0"/>
-      </w:pPr>
-      <w:r>
-        <w:t xml:space="preserve">Il sistema dovrà soddisfare i seguenti </w:t>
-      </w:r>
+    </w:p>
+    <w:p>
+      <w:pPr>
+        <w:spacing w:after="300" w:line="259" w:lineRule="auto"/>
+        <w:ind w:left="0" w:firstLine="0"/>
+      </w:pPr>
+      <w:r>
+        <w:t>Il sistema dovrà soddisfare i seguenti requisiti non funzionali organizzati secondo il modello FURPS+ :</w:t>
+      </w:r>
+    </w:p>
+    <w:p>
+      <w:pPr>
+        <w:spacing w:after="300" w:line="259" w:lineRule="auto"/>
+        <w:ind w:left="0" w:firstLine="0"/>
+      </w:pPr>
       <w:r>
         <w:rPr>
           <w:b/>
+          <w:bCs/>
         </w:rPr>
-        <w:t>requisiti</w:t>
-      </w:r>
-      <w:r>
-        <w:t xml:space="preserve"> </w:t>
-      </w:r>
+        <w:t>Usability</w:t>
+      </w:r>
+      <w:r>
+        <w:t xml:space="preserve"> </w:t>
+      </w:r>
+    </w:p>
+    <w:p>
+      <w:pPr>
+        <w:pStyle w:val="Paragrafoelenco"/>
+        <w:numPr>
+          <w:ilvl w:val="0"/>
+          <w:numId w:val="12"/>
+        </w:numPr>
+        <w:spacing w:after="300" w:line="259" w:lineRule="auto"/>
+      </w:pPr>
+      <w:r>
+        <w:t>L'interfaccia utente web deve essere intuitiva e consentire al cliente di completare la procedura di acquisto di un prodotto fino al checkout in un massimo di 5 click a partire dalla visualizzazione del carrello.</w:t>
+      </w:r>
+    </w:p>
+    <w:p>
+      <w:pPr>
+        <w:pStyle w:val="Paragrafoelenco"/>
+        <w:numPr>
+          <w:ilvl w:val="0"/>
+          <w:numId w:val="12"/>
+        </w:numPr>
+        <w:spacing w:after="300" w:line="259" w:lineRule="auto"/>
+      </w:pPr>
+      <w:r>
+        <w:t>L'interfaccia web deve essere responsive e garantire un'accessibilità ottimale su dispositivi mobili (smartphone, tablet) e desktop tramite i principali browser moderni (Chrome, Firefox, Edge, Safari) senza la necessità di installare plugin aggiuntivi.</w:t>
+      </w:r>
+    </w:p>
+    <w:p>
+      <w:pPr>
+        <w:pStyle w:val="Paragrafoelenco"/>
+        <w:numPr>
+          <w:ilvl w:val="0"/>
+          <w:numId w:val="12"/>
+        </w:numPr>
+        <w:spacing w:after="300" w:line="259" w:lineRule="auto"/>
+      </w:pPr>
+      <w:r>
+        <w:t>Il modulo di richiesta di assistenza tecnica deve guidare l'utente attraverso campi precompilati in base ai dispositivi in suo possesso, minimizzando la possibilità di errore nell'inserimento del guasto.</w:t>
+      </w:r>
+    </w:p>
+    <w:p>
+      <w:pPr>
+        <w:spacing w:after="300" w:line="259" w:lineRule="auto"/>
+        <w:ind w:left="0" w:firstLine="0"/>
+      </w:pPr>
       <w:r>
         <w:rPr>
           <w:b/>
+          <w:bCs/>
         </w:rPr>
-        <w:t>non funzionali</w:t>
-      </w:r>
-      <w:r>
-        <w:t xml:space="preserve"> e di qualità: </w:t>
-      </w:r>
-    </w:p>
-    <w:p>
-      <w:pPr>
-        <w:spacing w:after="0" w:line="259" w:lineRule="auto"/>
-        <w:ind w:left="0" w:firstLine="0"/>
-      </w:pPr>
-      <w:r>
-        <w:lastRenderedPageBreak/>
-        <w:t xml:space="preserve"> </w:t>
-      </w:r>
-    </w:p>
-    <w:p>
-      <w:pPr>
+        <w:t>Reliability</w:t>
+      </w:r>
+      <w:r>
+        <w:t xml:space="preserve"> (Affidabilità e Robustezza)</w:t>
+      </w:r>
+    </w:p>
+    <w:p>
+      <w:pPr>
+        <w:pStyle w:val="Paragrafoelenco"/>
         <w:numPr>
           <w:ilvl w:val="0"/>
-          <w:numId w:val="10"/>
+          <w:numId w:val="13"/>
         </w:numPr>
-        <w:ind w:right="75" w:hanging="351"/>
+        <w:spacing w:after="300" w:line="259" w:lineRule="auto"/>
+      </w:pPr>
+      <w:r>
+        <w:t>Il sistema deve garantire l'integrità dei dati salvati, aggiornando le disponibilità in inventario immediatamente dopo la conferma dell'ordine.</w:t>
+      </w:r>
+    </w:p>
+    <w:p>
+      <w:pPr>
+        <w:pStyle w:val="Paragrafoelenco"/>
+        <w:numPr>
+          <w:ilvl w:val="0"/>
+          <w:numId w:val="13"/>
+        </w:numPr>
+        <w:spacing w:after="300" w:line="259" w:lineRule="auto"/>
+      </w:pPr>
+      <w:r>
+        <w:t>In caso di caduta temporanea del sistema, nessun ordine confermato e pagato deve andare perso; il sistema deve consentire un recupero dello stato antecedente al blocco (fail-safe).</w:t>
+      </w:r>
+    </w:p>
+    <w:p>
+      <w:pPr>
+        <w:pStyle w:val="Paragrafoelenco"/>
+        <w:numPr>
+          <w:ilvl w:val="0"/>
+          <w:numId w:val="13"/>
+        </w:numPr>
+        <w:spacing w:after="300" w:line="259" w:lineRule="auto"/>
+      </w:pPr>
+      <w:r>
+        <w:t>Il sistema deve essere in grado di gestire picchi di richieste simultanee per i ticket di assistenza senza compromettere i dati degli interventi tecnici in corso.</w:t>
+      </w:r>
+    </w:p>
+    <w:p>
+      <w:pPr>
+        <w:spacing w:after="300" w:line="259" w:lineRule="auto"/>
       </w:pPr>
       <w:r>
         <w:rPr>
           <w:b/>
+          <w:bCs/>
         </w:rPr>
-        <w:t>Usabilità</w:t>
-      </w:r>
-      <w:r>
-        <w:t xml:space="preserve">: L'interfaccia web dovrà essere intuitiva, chiara, leggibile e responsive (adattabile a desktop e dispositivi mobili), guidando l'utente in modo semplice sia nell'acquisto dei prodotti sia nella compilazione del modulo di assistenza tecnica. </w:t>
-      </w:r>
-    </w:p>
-    <w:p>
-      <w:pPr>
+        <w:t>Performance</w:t>
+      </w:r>
+    </w:p>
+    <w:p>
+      <w:pPr>
+        <w:pStyle w:val="Paragrafoelenco"/>
         <w:numPr>
           <w:ilvl w:val="0"/>
-          <w:numId w:val="10"/>
+          <w:numId w:val="13"/>
         </w:numPr>
-        <w:ind w:right="75" w:hanging="351"/>
+        <w:spacing w:after="300" w:line="259" w:lineRule="auto"/>
+      </w:pPr>
+      <w:r>
+        <w:t>Il tempo di risposta del sistema durante la ricerca dei prodotti e il caricamento del catalogo non deve superare i 3 secondi con una normale connessione di rete (10 Mbps).</w:t>
+      </w:r>
+    </w:p>
+    <w:p>
+      <w:pPr>
+        <w:pStyle w:val="Paragrafoelenco"/>
+        <w:numPr>
+          <w:ilvl w:val="0"/>
+          <w:numId w:val="13"/>
+        </w:numPr>
+        <w:spacing w:after="300" w:line="259" w:lineRule="auto"/>
+      </w:pPr>
+      <w:r>
+        <w:t>L'invio della notifica per la generazione di un ticket di assistenza deve avvenire entro un tempo massimo di 30 secondi dalla conferma dell'invio.</w:t>
+      </w:r>
+    </w:p>
+    <w:p>
+      <w:pPr>
+        <w:pStyle w:val="Paragrafoelenco"/>
+        <w:numPr>
+          <w:ilvl w:val="0"/>
+          <w:numId w:val="13"/>
+        </w:numPr>
+        <w:spacing w:after="300" w:line="259" w:lineRule="auto"/>
+      </w:pPr>
+      <w:r>
+        <w:t>Il sistema deve supportare almeno 100 utenti connessi in modalità concorrente durante gli acquisti e le interrogazioni del catalogo.</w:t>
+      </w:r>
+    </w:p>
+    <w:p>
+      <w:pPr>
+        <w:spacing w:after="300" w:line="259" w:lineRule="auto"/>
+        <w:ind w:left="0" w:firstLine="0"/>
       </w:pPr>
       <w:r>
         <w:rPr>
           <w:b/>
+          <w:bCs/>
         </w:rPr>
-        <w:t>Prestazioni e Tempi di risposta</w:t>
-      </w:r>
-      <w:r>
-        <w:t xml:space="preserve">: Le operazioni di consultazione del catalogo, ricerca dinamica dei prodotti, gestione del carrello e aggiornamento dei ticket dovranno garantire tempi di risposta rapidi (inferiori ai 2-3 secondi in condizioni di carico normale). </w:t>
-      </w:r>
-    </w:p>
-    <w:p>
-      <w:pPr>
+        <w:t>Supportability</w:t>
+      </w:r>
+      <w:r>
+        <w:t xml:space="preserve"> (Manutenibilit</w:t>
+      </w:r>
+      <w:r>
+        <w:t>à</w:t>
+      </w:r>
+      <w:r>
+        <w:t>)</w:t>
+      </w:r>
+    </w:p>
+    <w:p>
+      <w:pPr>
+        <w:pStyle w:val="Paragrafoelenco"/>
         <w:numPr>
           <w:ilvl w:val="0"/>
-          <w:numId w:val="10"/>
+          <w:numId w:val="14"/>
         </w:numPr>
-        <w:ind w:right="75" w:hanging="351"/>
+        <w:spacing w:after="300" w:line="259" w:lineRule="auto"/>
+      </w:pPr>
+      <w:r>
+        <w:t>Il sistema deve essere progettato utilizzando il pattern architetturale MVC (Model-View-Controller) per separare in modo netto la logica di presentazione da quella di business e di accesso ai dati, al fine di favorire la manutenibilità a lungo termine.</w:t>
+      </w:r>
+    </w:p>
+    <w:p>
+      <w:pPr>
+        <w:pStyle w:val="Paragrafoelenco"/>
+        <w:numPr>
+          <w:ilvl w:val="0"/>
+          <w:numId w:val="14"/>
+        </w:numPr>
+        <w:spacing w:after="300" w:line="259" w:lineRule="auto"/>
+      </w:pPr>
+      <w:r>
+        <w:t>Il codice sorgente del sistema deve essere documentato secondo gli standard della progettazione Object-Oriented per permettere a futuri sviluppatori di integrare agevolmente nuove funzionalità.</w:t>
+      </w:r>
+    </w:p>
+    <w:p>
+      <w:pPr>
+        <w:pStyle w:val="Paragrafoelenco"/>
+        <w:numPr>
+          <w:ilvl w:val="0"/>
+          <w:numId w:val="14"/>
+        </w:numPr>
+        <w:spacing w:after="300" w:line="259" w:lineRule="auto"/>
+      </w:pPr>
+      <w:r>
+        <w:t>Deve essere presente una procedura definita per il recupero dei dati storici associati a ticket archiviati e a prodotti "disattivati in modo logico".</w:t>
+      </w:r>
+    </w:p>
+    <w:p>
+      <w:pPr>
+        <w:spacing w:after="300" w:line="259" w:lineRule="auto"/>
+        <w:ind w:left="0" w:firstLine="0"/>
       </w:pPr>
       <w:r>
         <w:rPr>
           <w:b/>
+          <w:bCs/>
         </w:rPr>
-        <w:t>Affidabilità e Integrità dei dati</w:t>
-      </w:r>
-      <w:r>
-        <w:t xml:space="preserve">: Il sistema dovrà garantire la consistenza dei dati nel database, aggiornando correttamente le disponibilità di magazzino all'atto dell'ordine e preservando lo storico degli ordini anche in caso di disattivazione logica di un prodotto. </w:t>
-      </w:r>
-    </w:p>
-    <w:p>
-      <w:pPr>
+        <w:t xml:space="preserve">Pseudo </w:t>
+      </w:r>
+      <w:r>
+        <w:rPr>
+          <w:b/>
+          <w:bCs/>
+        </w:rPr>
+        <w:t>R</w:t>
+      </w:r>
+      <w:r>
+        <w:rPr>
+          <w:b/>
+          <w:bCs/>
+        </w:rPr>
+        <w:t>equirements</w:t>
+      </w:r>
+      <w:r>
+        <w:t xml:space="preserve"> (Vincoli di Implementazione, Interfaccia, Operazioni, Sicurezza)</w:t>
+      </w:r>
+    </w:p>
+    <w:p>
+      <w:pPr>
+        <w:pStyle w:val="Paragrafoelenco"/>
         <w:numPr>
           <w:ilvl w:val="0"/>
-          <w:numId w:val="10"/>
+          <w:numId w:val="15"/>
         </w:numPr>
-        <w:ind w:right="75" w:hanging="351"/>
-      </w:pPr>
-      <w:r>
-        <w:rPr>
-          <w:b/>
-        </w:rPr>
-        <w:t>Sicurezza e Controllo degli accessi</w:t>
-      </w:r>
-      <w:r>
-        <w:t xml:space="preserve">: Le credenziali degli utenti dovranno essere protette; l'accesso alle aree riservate (pannello Amministratore e dashboard Tecnico) dovrà essere rigorosamente protetto tramite filtri di autenticazione e controllo delle sessioni. </w:t>
-      </w:r>
-    </w:p>
-    <w:p>
-      <w:pPr>
+        <w:spacing w:after="300" w:line="259" w:lineRule="auto"/>
+      </w:pPr>
+      <w:r>
+        <w:t>Sicurezza: L'accesso alle aree riservate (pannello Amministratore e dashboard Tecnico) deve essere strettamente controllato da un sistema di autenticazione e di gestione basato sui permessi di ruolo; le credenziali (password) devono essere salvate in formato cifrato.</w:t>
+      </w:r>
+    </w:p>
+    <w:p>
+      <w:pPr>
+        <w:pStyle w:val="Paragrafoelenco"/>
         <w:numPr>
           <w:ilvl w:val="0"/>
-          <w:numId w:val="10"/>
+          <w:numId w:val="15"/>
         </w:numPr>
-        <w:ind w:right="75" w:hanging="351"/>
-      </w:pPr>
-      <w:r>
-        <w:rPr>
-          <w:b/>
-        </w:rPr>
-        <w:t>Manutenibilità e Modularità</w:t>
-      </w:r>
-      <w:r>
-        <w:t xml:space="preserve">: Il sistema dovrà essere progettato secondo il pattern architetturale MVC (Model-View-Controller) e i principi dell'ingegneria del software orientata agli oggetti per future estensioni. </w:t>
-      </w:r>
-    </w:p>
-    <w:p>
-      <w:pPr>
+        <w:spacing w:after="300" w:line="259" w:lineRule="auto"/>
+      </w:pPr>
+      <w:r>
+        <w:lastRenderedPageBreak/>
+        <w:t>Architettura Software: Il sistema deve essere implementato adottando un'architettura Three-Tier, utilizzando il linguaggio Java (tecnologia Java EE / Servlet).</w:t>
+      </w:r>
+    </w:p>
+    <w:p>
+      <w:pPr>
+        <w:pStyle w:val="Paragrafoelenco"/>
         <w:numPr>
           <w:ilvl w:val="0"/>
-          <w:numId w:val="10"/>
+          <w:numId w:val="15"/>
         </w:numPr>
-        <w:ind w:right="75" w:hanging="351"/>
-      </w:pPr>
-      <w:r>
-        <w:rPr>
-          <w:b/>
-        </w:rPr>
-        <w:t>Portabilità</w:t>
-      </w:r>
-      <w:r>
-        <w:t xml:space="preserve">: L'applicazione web dovrà essere accessibile tramite i principali browser moderni (Chrome, Firefox, Edge, Safari) senza necessità di installare plugin aggiuntivi lato client. </w:t>
-      </w:r>
-    </w:p>
-    <w:p>
-      <w:pPr>
         <w:spacing w:after="300" w:line="259" w:lineRule="auto"/>
-        <w:ind w:left="0" w:firstLine="0"/>
-      </w:pPr>
+      </w:pPr>
+      <w:r>
+        <w:t>Environment: L'infrastruttura di erogazione (Application Server) si appoggerà su Apache Tomcat, mentre per la persistenza dei dati il Data Tier dovrà appoggiarsi a un DBMS relazionale MySQL.</w:t>
+      </w:r>
+    </w:p>
+    <w:p>
+      <w:pPr>
+        <w:pStyle w:val="Paragrafoelenco"/>
+        <w:numPr>
+          <w:ilvl w:val="0"/>
+          <w:numId w:val="15"/>
+        </w:numPr>
+        <w:spacing w:after="300" w:line="259" w:lineRule="auto"/>
+      </w:pPr>
+      <w:r>
+        <w:t>Versioning: Tutto il codice sorgente e la documentazione del progetto devono risiedere sul repository GitHub del progetto gestito con opportuno versioning.</w:t>
+      </w:r>
       <w:r>
         <w:t xml:space="preserve"> </w:t>
       </w:r>
@@ -4088,19 +4469,14 @@
         <w:pStyle w:val="Titolo1"/>
         <w:ind w:left="306" w:hanging="321"/>
       </w:pPr>
-      <w:bookmarkStart w:id="4" w:name="_Toc11205"/>
-      <w:r>
-        <w:t xml:space="preserve">Target </w:t>
-      </w:r>
-      <w:proofErr w:type="spellStart"/>
-      <w:r>
-        <w:t>environment</w:t>
-      </w:r>
-      <w:proofErr w:type="spellEnd"/>
-      <w:r>
-        <w:t xml:space="preserve"> </w:t>
+      <w:bookmarkStart w:id="4" w:name="_Toc242809686"/>
+      <w:r>
+        <w:t>Target environment</w:t>
       </w:r>
       <w:bookmarkEnd w:id="4"/>
+      <w:r>
+        <w:t xml:space="preserve"> </w:t>
+      </w:r>
     </w:p>
     <w:p>
       <w:pPr>
@@ -4121,18 +4497,7 @@
         <w:ind w:left="0" w:right="75" w:firstLine="0"/>
       </w:pPr>
       <w:r>
-        <w:t xml:space="preserve">Il sistema software </w:t>
-      </w:r>
-      <w:proofErr w:type="spellStart"/>
-      <w:r>
-        <w:t>Demarcaf</w:t>
-      </w:r>
-      <w:proofErr w:type="spellEnd"/>
-      <w:r>
-        <w:t xml:space="preserve"> sarà basato su un'architettura Three-</w:t>
-      </w:r>
-      <w:r>
-        <w:t xml:space="preserve">Tier (a tre livelli), garantendo la netta separazione tra il livello di presentazione, la logica applicativa e la gestione dei dati:  </w:t>
+        <w:t xml:space="preserve">Il sistema software Demarcaf sarà basato su un'architettura Three-Tier (a tre livelli), garantendo la netta separazione tra il livello di presentazione, la logica applicativa e la gestione dei dati:  </w:t>
       </w:r>
     </w:p>
     <w:p>
@@ -4166,18 +4531,7 @@
         <w:ind w:left="0" w:right="75" w:firstLine="0"/>
       </w:pPr>
       <w:r>
-        <w:t xml:space="preserve">2.Application / Middle Tier (Livello Server): Implementa la logica applicativa e di business del sistema secondo il pattern MVC. Sarà sviluppato </w:t>
-      </w:r>
-      <w:r>
-        <w:t xml:space="preserve">in linguaggio Java (tecnologia Java EE / Jakarta EE tramite </w:t>
-      </w:r>
-      <w:proofErr w:type="spellStart"/>
-      <w:r>
-        <w:t>Servlet</w:t>
-      </w:r>
-      <w:proofErr w:type="spellEnd"/>
-      <w:r>
-        <w:t xml:space="preserve">) ed eseguito su Web/Application Server Apache Tomcat.  </w:t>
+        <w:t xml:space="preserve">2.Application / Middle Tier (Livello Server): Implementa la logica applicativa e di business del sistema secondo il pattern MVC. Sarà sviluppato in linguaggio Java (tecnologia Java EE / Jakarta EE tramite Servlet) ed eseguito su Web/Application Server Apache Tomcat.  </w:t>
       </w:r>
     </w:p>
     <w:p>
@@ -4211,15 +4565,7 @@
         <w:ind w:left="0" w:right="75" w:firstLine="0"/>
       </w:pPr>
       <w:r>
-        <w:t xml:space="preserve">I tre livelli architetturali saranno progettati in modo disaccoppiato così da risultare potenzialmente installabili ed eseguibili su tre macchine distinte. Per la gestione </w:t>
-      </w:r>
-      <w:proofErr w:type="gramStart"/>
-      <w:r>
-        <w:t>del  lavoro</w:t>
-      </w:r>
-      <w:proofErr w:type="gramEnd"/>
-      <w:r>
-        <w:t xml:space="preserve"> collaborativo verrà utilizzato GitHub. </w:t>
+        <w:t xml:space="preserve">I tre livelli architetturali saranno progettati in modo disaccoppiato così da risultare potenzialmente installabili ed eseguibili su tre macchine distinte. Per la gestione del  lavoro collaborativo verrà utilizzato GitHub. </w:t>
       </w:r>
     </w:p>
     <w:p>
@@ -4244,12 +4590,16 @@
         </w:numPr>
         <w:ind w:left="-5"/>
       </w:pPr>
-      <w:bookmarkStart w:id="5" w:name="_Toc11206"/>
-      <w:r>
-        <w:t xml:space="preserve">6.Deliverable &amp; deadlines  </w:t>
+      <w:bookmarkStart w:id="5" w:name="_Toc242809687"/>
+      <w:r>
+        <w:t>6.Deliverable &amp; deadlines</w:t>
       </w:r>
       <w:bookmarkEnd w:id="5"/>
-    </w:p>
+      <w:r>
+        <w:t xml:space="preserve"> </w:t>
+      </w:r>
+    </w:p>
+    <w:p/>
     <w:p>
       <w:pPr>
         <w:ind w:left="0" w:right="75" w:firstLine="0"/>
@@ -4272,15 +4622,7 @@
         <w:ind w:left="0" w:right="75" w:firstLine="0"/>
       </w:pPr>
       <w:r>
-        <w:t xml:space="preserve">15 ottobre 2026: Consegna del </w:t>
-      </w:r>
-      <w:proofErr w:type="spellStart"/>
-      <w:r>
-        <w:t>Problem</w:t>
-      </w:r>
-      <w:proofErr w:type="spellEnd"/>
-      <w:r>
-        <w:t xml:space="preserve"> Statement. </w:t>
+        <w:t xml:space="preserve">15 ottobre 2026: Consegna del Problem Statement. </w:t>
       </w:r>
     </w:p>
     <w:p>
@@ -4314,23 +4656,7 @@
         <w:ind w:left="0" w:right="75" w:firstLine="0"/>
       </w:pPr>
       <w:r>
-        <w:t xml:space="preserve">12 novembre 2026: Consegna del </w:t>
-      </w:r>
-      <w:proofErr w:type="spellStart"/>
-      <w:r>
-        <w:t>Requirements</w:t>
-      </w:r>
-      <w:proofErr w:type="spellEnd"/>
-      <w:r>
-        <w:t xml:space="preserve"> Analysis </w:t>
-      </w:r>
-      <w:proofErr w:type="spellStart"/>
-      <w:r>
-        <w:t>Document</w:t>
-      </w:r>
-      <w:proofErr w:type="spellEnd"/>
-      <w:r>
-        <w:t xml:space="preserve"> (RAD) per l'intero sistema.  </w:t>
+        <w:t xml:space="preserve">12 novembre 2026: Consegna del Requirements Analysis Document (RAD) per l'intero sistema.  </w:t>
       </w:r>
     </w:p>
     <w:p>
@@ -4347,16 +4673,7 @@
         <w:ind w:left="0" w:right="75" w:firstLine="0"/>
       </w:pPr>
       <w:r>
-        <w:lastRenderedPageBreak/>
-        <w:t xml:space="preserve">26 novembre 2026: Consegna del System Design </w:t>
-      </w:r>
-      <w:proofErr w:type="spellStart"/>
-      <w:r>
-        <w:t>Document</w:t>
-      </w:r>
-      <w:proofErr w:type="spellEnd"/>
-      <w:r>
-        <w:t xml:space="preserve"> (SDD) per l'intero sistema.  </w:t>
+        <w:t xml:space="preserve">26 novembre 2026: Consegna del System Design Document (SDD) per l'intero sistema.  </w:t>
       </w:r>
     </w:p>
     <w:p>
@@ -4373,15 +4690,7 @@
         <w:ind w:left="0" w:right="75" w:firstLine="0"/>
       </w:pPr>
       <w:r>
-        <w:t xml:space="preserve">17 dicembre 2026: Consegna della Specifica delle interfacce dei moduli (parte dell'ODD) e del Test Plan e Test Case </w:t>
-      </w:r>
-      <w:proofErr w:type="spellStart"/>
-      <w:r>
-        <w:t>Specification</w:t>
-      </w:r>
-      <w:proofErr w:type="spellEnd"/>
-      <w:r>
-        <w:t xml:space="preserve"> per lo stralcio del sistema scelto. </w:t>
+        <w:t xml:space="preserve">17 dicembre 2026: Consegna della Specifica delle interfacce dei moduli (parte dell'ODD) e del Test Plan e Test Case Specification per lo stralcio del sistema scelto. </w:t>
       </w:r>
     </w:p>
     <w:p>
@@ -4398,23 +4707,7 @@
         <w:ind w:left="0" w:right="75" w:firstLine="0"/>
       </w:pPr>
       <w:r>
-        <w:t xml:space="preserve">Prima della discussione finale: Consegna del codice relativo allo stralcio sviluppato, completamento dell'Object Design </w:t>
-      </w:r>
-      <w:proofErr w:type="spellStart"/>
-      <w:r>
-        <w:t>Document</w:t>
-      </w:r>
-      <w:proofErr w:type="spellEnd"/>
-      <w:r>
-        <w:t xml:space="preserve"> (ODD) e Test </w:t>
-      </w:r>
-      <w:proofErr w:type="spellStart"/>
-      <w:r>
-        <w:t>Execution</w:t>
-      </w:r>
-      <w:proofErr w:type="spellEnd"/>
-      <w:r>
-        <w:t xml:space="preserve"> Report. </w:t>
+        <w:t xml:space="preserve">Prima della discussione finale: Consegna del codice relativo allo stralcio sviluppato, completamento dell'Object Design Document (ODD) e Test Execution Report. </w:t>
       </w:r>
     </w:p>
     <w:sectPr>
@@ -4427,7 +4720,7 @@
 </file>
 
 <file path=word/numbering.xml><?xml version="1.0" encoding="utf-8"?>
-<w:numbering xmlns:wpc="http://schemas.microsoft.com/office/word/2010/wordprocessingCanvas" xmlns:cx="http://schemas.microsoft.com/office/drawing/2014/chartex" xmlns:cx1="http://schemas.microsoft.com/office/drawing/2015/9/8/chartex" xmlns:cx2="http://schemas.microsoft.com/office/drawing/2015/10/21/chartex" xmlns:cx3="http://schemas.microsoft.com/office/drawing/2016/5/9/chartex" xmlns:cx4="http://schemas.microsoft.com/office/drawing/2016/5/10/chartex" xmlns:cx5="http://schemas.microsoft.com/office/drawing/2016/5/11/chartex" xmlns:cx6="http://schemas.microsoft.com/office/drawing/2016/5/12/chartex" xmlns:cx7="http://schemas.microsoft.com/office/drawing/2016/5/13/chartex" xmlns:cx8="http://schemas.microsoft.com/office/drawing/2016/5/14/chartex" xmlns:mc="http://schemas.openxmlformats.org/markup-compatibility/2006" xmlns:aink="http://schemas.microsoft.com/office/drawing/2016/ink" xmlns:am3d="http://schemas.microsoft.com/office/drawing/2017/model3d" xmlns:o="urn:schemas-microsoft-com:office:office" xmlns:oel="http://schemas.microsoft.com/office/2019/extlst" xmlns:r="http://schemas.openxmlformats.org/officeDocument/2006/relationships" xmlns:m="http://schemas.openxmlformats.org/officeDocument/2006/math" xmlns:v="urn:schemas-microsoft-com:vml" xmlns:wp14="http://schemas.microsoft.com/office/word/2010/wordprocessingDrawing" xmlns:wp="http://schemas.openxmlformats.org/drawingml/2006/wordprocessingDrawing" xmlns:w10="urn:schemas-microsoft-com:office:word" xmlns:w="http://schemas.openxmlformats.org/wordprocessingml/2006/main" xmlns:w14="http://schemas.microsoft.com/office/word/2010/wordml" xmlns:w15="http://schemas.microsoft.com/office/word/2012/wordml" xmlns:w16cex="http://schemas.microsoft.com/office/word/2018/wordml/cex" xmlns:w16cid="http://schemas.microsoft.com/office/word/2016/wordml/cid" xmlns:w16="http://schemas.microsoft.com/office/word/2018/wordml" xmlns:w16du="http://schemas.microsoft.com/office/word/2023/wordml/word16du" xmlns:w16sdtdh="http://schemas.microsoft.com/office/word/2020/wordml/sdtdatahash" xmlns:w16sdtfl="http://schemas.microsoft.com/office/word/2024/wordml/sdtformatlock" xmlns:w16se="http://schemas.microsoft.com/office/word/2015/wordml/symex" xmlns:wpg="http://schemas.microsoft.com/office/word/2010/wordprocessingGroup" xmlns:wpi="http://schemas.microsoft.com/office/word/2010/wordprocessingInk" xmlns:wne="http://schemas.microsoft.com/office/word/2006/wordml" xmlns:wps="http://schemas.microsoft.com/office/word/2010/wordprocessingShape" mc:Ignorable="w14 w15 w16se w16cid w16 w16cex w16sdtdh w16sdtfl w16du wp14">
+<w:numbering xmlns:wpc="http://schemas.microsoft.com/office/word/2010/wordprocessingCanvas" xmlns:cx="http://schemas.microsoft.com/office/drawing/2014/chartex" xmlns:cx1="http://schemas.microsoft.com/office/drawing/2015/9/8/chartex" xmlns:cx2="http://schemas.microsoft.com/office/drawing/2015/10/21/chartex" xmlns:cx3="http://schemas.microsoft.com/office/drawing/2016/5/9/chartex" xmlns:cx4="http://schemas.microsoft.com/office/drawing/2016/5/10/chartex" xmlns:cx5="http://schemas.microsoft.com/office/drawing/2016/5/11/chartex" xmlns:cx6="http://schemas.microsoft.com/office/drawing/2016/5/12/chartex" xmlns:cx7="http://schemas.microsoft.com/office/drawing/2016/5/13/chartex" xmlns:cx8="http://schemas.microsoft.com/office/drawing/2016/5/14/chartex" xmlns:mc="http://schemas.openxmlformats.org/markup-compatibility/2006" xmlns:aink="http://schemas.microsoft.com/office/drawing/2016/ink" xmlns:am3d="http://schemas.microsoft.com/office/drawing/2017/model3d" xmlns:o="urn:schemas-microsoft-com:office:office" xmlns:r="http://schemas.openxmlformats.org/officeDocument/2006/relationships" xmlns:m="http://schemas.openxmlformats.org/officeDocument/2006/math" xmlns:v="urn:schemas-microsoft-com:vml" xmlns:wp14="http://schemas.microsoft.com/office/word/2010/wordprocessingDrawing" xmlns:wp="http://schemas.openxmlformats.org/drawingml/2006/wordprocessingDrawing" xmlns:w10="urn:schemas-microsoft-com:office:word" xmlns:w="http://schemas.openxmlformats.org/wordprocessingml/2006/main" xmlns:w14="http://schemas.microsoft.com/office/word/2010/wordml" xmlns:w15="http://schemas.microsoft.com/office/word/2012/wordml" xmlns:w16cex="http://schemas.microsoft.com/office/word/2018/wordml/cex" xmlns:w16cid="http://schemas.microsoft.com/office/word/2016/wordml/cid" xmlns:w16="http://schemas.microsoft.com/office/word/2018/wordml" xmlns:w16sdtdh="http://schemas.microsoft.com/office/word/2020/wordml/sdtdatahash" xmlns:w16se="http://schemas.microsoft.com/office/word/2015/wordml/symex" xmlns:wpg="http://schemas.microsoft.com/office/word/2010/wordprocessingGroup" xmlns:wpi="http://schemas.microsoft.com/office/word/2010/wordprocessingInk" xmlns:wne="http://schemas.microsoft.com/office/word/2006/wordml" xmlns:wps="http://schemas.microsoft.com/office/word/2010/wordprocessingShape" mc:Ignorable="w14 w15 w16se w16cid w16 w16cex w16sdtdh wp14">
   <w:abstractNum w:abstractNumId="0" w15:restartNumberingAfterBreak="0">
     <w:nsid w:val="0FCD6126"/>
     <w:multiLevelType w:val="hybridMultilevel"/>
@@ -5923,6 +6216,130 @@
     </w:lvl>
   </w:abstractNum>
   <w:abstractNum w:abstractNumId="7" w15:restartNumberingAfterBreak="0">
+    <w:nsid w:val="51EE61FD"/>
+    <w:multiLevelType w:val="hybridMultilevel"/>
+    <w:tmpl w:val="DDE07770"/>
+    <w:lvl w:ilvl="0" w:tplc="C1705B3E">
+      <w:start w:val="1"/>
+      <w:numFmt w:val="bullet"/>
+      <w:lvlText w:val="•"/>
+      <w:lvlJc w:val="left"/>
+      <w:pPr>
+        <w:ind w:left="720" w:hanging="360"/>
+      </w:pPr>
+      <w:rPr>
+        <w:rFonts w:ascii="Arial" w:eastAsia="Arial" w:hAnsi="Arial" w:cs="Arial"/>
+        <w:b w:val="0"/>
+        <w:i w:val="0"/>
+        <w:strike w:val="0"/>
+        <w:dstrike w:val="0"/>
+        <w:color w:val="000000"/>
+        <w:sz w:val="20"/>
+        <w:szCs w:val="20"/>
+        <w:u w:val="none" w:color="000000"/>
+        <w:bdr w:val="none" w:sz="0" w:space="0" w:color="auto"/>
+        <w:shd w:val="clear" w:color="auto" w:fill="auto"/>
+        <w:vertAlign w:val="baseline"/>
+      </w:rPr>
+    </w:lvl>
+    <w:lvl w:ilvl="1" w:tplc="04100003" w:tentative="1">
+      <w:start w:val="1"/>
+      <w:numFmt w:val="bullet"/>
+      <w:lvlText w:val="o"/>
+      <w:lvlJc w:val="left"/>
+      <w:pPr>
+        <w:ind w:left="1440" w:hanging="360"/>
+      </w:pPr>
+      <w:rPr>
+        <w:rFonts w:ascii="Courier New" w:hAnsi="Courier New" w:cs="Courier New" w:hint="default"/>
+      </w:rPr>
+    </w:lvl>
+    <w:lvl w:ilvl="2" w:tplc="04100005" w:tentative="1">
+      <w:start w:val="1"/>
+      <w:numFmt w:val="bullet"/>
+      <w:lvlText w:val=""/>
+      <w:lvlJc w:val="left"/>
+      <w:pPr>
+        <w:ind w:left="2160" w:hanging="360"/>
+      </w:pPr>
+      <w:rPr>
+        <w:rFonts w:ascii="Wingdings" w:hAnsi="Wingdings" w:hint="default"/>
+      </w:rPr>
+    </w:lvl>
+    <w:lvl w:ilvl="3" w:tplc="04100001" w:tentative="1">
+      <w:start w:val="1"/>
+      <w:numFmt w:val="bullet"/>
+      <w:lvlText w:val=""/>
+      <w:lvlJc w:val="left"/>
+      <w:pPr>
+        <w:ind w:left="2880" w:hanging="360"/>
+      </w:pPr>
+      <w:rPr>
+        <w:rFonts w:ascii="Symbol" w:hAnsi="Symbol" w:hint="default"/>
+      </w:rPr>
+    </w:lvl>
+    <w:lvl w:ilvl="4" w:tplc="04100003" w:tentative="1">
+      <w:start w:val="1"/>
+      <w:numFmt w:val="bullet"/>
+      <w:lvlText w:val="o"/>
+      <w:lvlJc w:val="left"/>
+      <w:pPr>
+        <w:ind w:left="3600" w:hanging="360"/>
+      </w:pPr>
+      <w:rPr>
+        <w:rFonts w:ascii="Courier New" w:hAnsi="Courier New" w:cs="Courier New" w:hint="default"/>
+      </w:rPr>
+    </w:lvl>
+    <w:lvl w:ilvl="5" w:tplc="04100005" w:tentative="1">
+      <w:start w:val="1"/>
+      <w:numFmt w:val="bullet"/>
+      <w:lvlText w:val=""/>
+      <w:lvlJc w:val="left"/>
+      <w:pPr>
+        <w:ind w:left="4320" w:hanging="360"/>
+      </w:pPr>
+      <w:rPr>
+        <w:rFonts w:ascii="Wingdings" w:hAnsi="Wingdings" w:hint="default"/>
+      </w:rPr>
+    </w:lvl>
+    <w:lvl w:ilvl="6" w:tplc="04100001" w:tentative="1">
+      <w:start w:val="1"/>
+      <w:numFmt w:val="bullet"/>
+      <w:lvlText w:val=""/>
+      <w:lvlJc w:val="left"/>
+      <w:pPr>
+        <w:ind w:left="5040" w:hanging="360"/>
+      </w:pPr>
+      <w:rPr>
+        <w:rFonts w:ascii="Symbol" w:hAnsi="Symbol" w:hint="default"/>
+      </w:rPr>
+    </w:lvl>
+    <w:lvl w:ilvl="7" w:tplc="04100003" w:tentative="1">
+      <w:start w:val="1"/>
+      <w:numFmt w:val="bullet"/>
+      <w:lvlText w:val="o"/>
+      <w:lvlJc w:val="left"/>
+      <w:pPr>
+        <w:ind w:left="5760" w:hanging="360"/>
+      </w:pPr>
+      <w:rPr>
+        <w:rFonts w:ascii="Courier New" w:hAnsi="Courier New" w:cs="Courier New" w:hint="default"/>
+      </w:rPr>
+    </w:lvl>
+    <w:lvl w:ilvl="8" w:tplc="04100005" w:tentative="1">
+      <w:start w:val="1"/>
+      <w:numFmt w:val="bullet"/>
+      <w:lvlText w:val=""/>
+      <w:lvlJc w:val="left"/>
+      <w:pPr>
+        <w:ind w:left="6480" w:hanging="360"/>
+      </w:pPr>
+      <w:rPr>
+        <w:rFonts w:ascii="Wingdings" w:hAnsi="Wingdings" w:hint="default"/>
+      </w:rPr>
+    </w:lvl>
+  </w:abstractNum>
+  <w:abstractNum w:abstractNumId="8" w15:restartNumberingAfterBreak="0">
     <w:nsid w:val="539B264D"/>
     <w:multiLevelType w:val="hybridMultilevel"/>
     <w:tmpl w:val="2E6A0616"/>
@@ -6134,7 +6551,7 @@
       </w:rPr>
     </w:lvl>
   </w:abstractNum>
-  <w:abstractNum w:abstractNumId="8" w15:restartNumberingAfterBreak="0">
+  <w:abstractNum w:abstractNumId="9" w15:restartNumberingAfterBreak="0">
     <w:nsid w:val="61291FDE"/>
     <w:multiLevelType w:val="hybridMultilevel"/>
     <w:tmpl w:val="7D5EF4F8"/>
@@ -6346,7 +6763,7 @@
       </w:rPr>
     </w:lvl>
   </w:abstractNum>
-  <w:abstractNum w:abstractNumId="9" w15:restartNumberingAfterBreak="0">
+  <w:abstractNum w:abstractNumId="10" w15:restartNumberingAfterBreak="0">
     <w:nsid w:val="636F6D81"/>
     <w:multiLevelType w:val="hybridMultilevel"/>
     <w:tmpl w:val="82FEE114"/>
@@ -6558,7 +6975,7 @@
       </w:rPr>
     </w:lvl>
   </w:abstractNum>
-  <w:abstractNum w:abstractNumId="10" w15:restartNumberingAfterBreak="0">
+  <w:abstractNum w:abstractNumId="11" w15:restartNumberingAfterBreak="0">
     <w:nsid w:val="6A046A67"/>
     <w:multiLevelType w:val="hybridMultilevel"/>
     <w:tmpl w:val="69AE9800"/>
@@ -6770,44 +7187,428 @@
       </w:rPr>
     </w:lvl>
   </w:abstractNum>
-  <w:num w:numId="1" w16cid:durableId="97527334">
+  <w:abstractNum w:abstractNumId="12" w15:restartNumberingAfterBreak="0">
+    <w:nsid w:val="74780096"/>
+    <w:multiLevelType w:val="hybridMultilevel"/>
+    <w:tmpl w:val="502AE46E"/>
+    <w:lvl w:ilvl="0" w:tplc="C1705B3E">
+      <w:start w:val="1"/>
+      <w:numFmt w:val="bullet"/>
+      <w:lvlText w:val="•"/>
+      <w:lvlJc w:val="left"/>
+      <w:pPr>
+        <w:ind w:left="720" w:hanging="360"/>
+      </w:pPr>
+      <w:rPr>
+        <w:rFonts w:ascii="Arial" w:eastAsia="Arial" w:hAnsi="Arial" w:cs="Arial"/>
+        <w:b w:val="0"/>
+        <w:i w:val="0"/>
+        <w:strike w:val="0"/>
+        <w:dstrike w:val="0"/>
+        <w:color w:val="000000"/>
+        <w:sz w:val="20"/>
+        <w:szCs w:val="20"/>
+        <w:u w:val="none" w:color="000000"/>
+        <w:bdr w:val="none" w:sz="0" w:space="0" w:color="auto"/>
+        <w:shd w:val="clear" w:color="auto" w:fill="auto"/>
+        <w:vertAlign w:val="baseline"/>
+      </w:rPr>
+    </w:lvl>
+    <w:lvl w:ilvl="1" w:tplc="04100003" w:tentative="1">
+      <w:start w:val="1"/>
+      <w:numFmt w:val="bullet"/>
+      <w:lvlText w:val="o"/>
+      <w:lvlJc w:val="left"/>
+      <w:pPr>
+        <w:ind w:left="1440" w:hanging="360"/>
+      </w:pPr>
+      <w:rPr>
+        <w:rFonts w:ascii="Courier New" w:hAnsi="Courier New" w:cs="Courier New" w:hint="default"/>
+      </w:rPr>
+    </w:lvl>
+    <w:lvl w:ilvl="2" w:tplc="04100005" w:tentative="1">
+      <w:start w:val="1"/>
+      <w:numFmt w:val="bullet"/>
+      <w:lvlText w:val=""/>
+      <w:lvlJc w:val="left"/>
+      <w:pPr>
+        <w:ind w:left="2160" w:hanging="360"/>
+      </w:pPr>
+      <w:rPr>
+        <w:rFonts w:ascii="Wingdings" w:hAnsi="Wingdings" w:hint="default"/>
+      </w:rPr>
+    </w:lvl>
+    <w:lvl w:ilvl="3" w:tplc="04100001" w:tentative="1">
+      <w:start w:val="1"/>
+      <w:numFmt w:val="bullet"/>
+      <w:lvlText w:val=""/>
+      <w:lvlJc w:val="left"/>
+      <w:pPr>
+        <w:ind w:left="2880" w:hanging="360"/>
+      </w:pPr>
+      <w:rPr>
+        <w:rFonts w:ascii="Symbol" w:hAnsi="Symbol" w:hint="default"/>
+      </w:rPr>
+    </w:lvl>
+    <w:lvl w:ilvl="4" w:tplc="04100003" w:tentative="1">
+      <w:start w:val="1"/>
+      <w:numFmt w:val="bullet"/>
+      <w:lvlText w:val="o"/>
+      <w:lvlJc w:val="left"/>
+      <w:pPr>
+        <w:ind w:left="3600" w:hanging="360"/>
+      </w:pPr>
+      <w:rPr>
+        <w:rFonts w:ascii="Courier New" w:hAnsi="Courier New" w:cs="Courier New" w:hint="default"/>
+      </w:rPr>
+    </w:lvl>
+    <w:lvl w:ilvl="5" w:tplc="04100005" w:tentative="1">
+      <w:start w:val="1"/>
+      <w:numFmt w:val="bullet"/>
+      <w:lvlText w:val=""/>
+      <w:lvlJc w:val="left"/>
+      <w:pPr>
+        <w:ind w:left="4320" w:hanging="360"/>
+      </w:pPr>
+      <w:rPr>
+        <w:rFonts w:ascii="Wingdings" w:hAnsi="Wingdings" w:hint="default"/>
+      </w:rPr>
+    </w:lvl>
+    <w:lvl w:ilvl="6" w:tplc="04100001" w:tentative="1">
+      <w:start w:val="1"/>
+      <w:numFmt w:val="bullet"/>
+      <w:lvlText w:val=""/>
+      <w:lvlJc w:val="left"/>
+      <w:pPr>
+        <w:ind w:left="5040" w:hanging="360"/>
+      </w:pPr>
+      <w:rPr>
+        <w:rFonts w:ascii="Symbol" w:hAnsi="Symbol" w:hint="default"/>
+      </w:rPr>
+    </w:lvl>
+    <w:lvl w:ilvl="7" w:tplc="04100003" w:tentative="1">
+      <w:start w:val="1"/>
+      <w:numFmt w:val="bullet"/>
+      <w:lvlText w:val="o"/>
+      <w:lvlJc w:val="left"/>
+      <w:pPr>
+        <w:ind w:left="5760" w:hanging="360"/>
+      </w:pPr>
+      <w:rPr>
+        <w:rFonts w:ascii="Courier New" w:hAnsi="Courier New" w:cs="Courier New" w:hint="default"/>
+      </w:rPr>
+    </w:lvl>
+    <w:lvl w:ilvl="8" w:tplc="04100005" w:tentative="1">
+      <w:start w:val="1"/>
+      <w:numFmt w:val="bullet"/>
+      <w:lvlText w:val=""/>
+      <w:lvlJc w:val="left"/>
+      <w:pPr>
+        <w:ind w:left="6480" w:hanging="360"/>
+      </w:pPr>
+      <w:rPr>
+        <w:rFonts w:ascii="Wingdings" w:hAnsi="Wingdings" w:hint="default"/>
+      </w:rPr>
+    </w:lvl>
+  </w:abstractNum>
+  <w:abstractNum w:abstractNumId="13" w15:restartNumberingAfterBreak="0">
+    <w:nsid w:val="773D2E51"/>
+    <w:multiLevelType w:val="hybridMultilevel"/>
+    <w:tmpl w:val="22AEB77C"/>
+    <w:lvl w:ilvl="0" w:tplc="C1705B3E">
+      <w:start w:val="1"/>
+      <w:numFmt w:val="bullet"/>
+      <w:lvlText w:val="•"/>
+      <w:lvlJc w:val="left"/>
+      <w:pPr>
+        <w:ind w:left="720" w:hanging="360"/>
+      </w:pPr>
+      <w:rPr>
+        <w:rFonts w:ascii="Arial" w:eastAsia="Arial" w:hAnsi="Arial" w:cs="Arial"/>
+        <w:b w:val="0"/>
+        <w:i w:val="0"/>
+        <w:strike w:val="0"/>
+        <w:dstrike w:val="0"/>
+        <w:color w:val="000000"/>
+        <w:sz w:val="20"/>
+        <w:szCs w:val="20"/>
+        <w:u w:val="none" w:color="000000"/>
+        <w:bdr w:val="none" w:sz="0" w:space="0" w:color="auto"/>
+        <w:shd w:val="clear" w:color="auto" w:fill="auto"/>
+        <w:vertAlign w:val="baseline"/>
+      </w:rPr>
+    </w:lvl>
+    <w:lvl w:ilvl="1" w:tplc="04100003" w:tentative="1">
+      <w:start w:val="1"/>
+      <w:numFmt w:val="bullet"/>
+      <w:lvlText w:val="o"/>
+      <w:lvlJc w:val="left"/>
+      <w:pPr>
+        <w:ind w:left="1440" w:hanging="360"/>
+      </w:pPr>
+      <w:rPr>
+        <w:rFonts w:ascii="Courier New" w:hAnsi="Courier New" w:cs="Courier New" w:hint="default"/>
+      </w:rPr>
+    </w:lvl>
+    <w:lvl w:ilvl="2" w:tplc="04100005" w:tentative="1">
+      <w:start w:val="1"/>
+      <w:numFmt w:val="bullet"/>
+      <w:lvlText w:val=""/>
+      <w:lvlJc w:val="left"/>
+      <w:pPr>
+        <w:ind w:left="2160" w:hanging="360"/>
+      </w:pPr>
+      <w:rPr>
+        <w:rFonts w:ascii="Wingdings" w:hAnsi="Wingdings" w:hint="default"/>
+      </w:rPr>
+    </w:lvl>
+    <w:lvl w:ilvl="3" w:tplc="04100001" w:tentative="1">
+      <w:start w:val="1"/>
+      <w:numFmt w:val="bullet"/>
+      <w:lvlText w:val=""/>
+      <w:lvlJc w:val="left"/>
+      <w:pPr>
+        <w:ind w:left="2880" w:hanging="360"/>
+      </w:pPr>
+      <w:rPr>
+        <w:rFonts w:ascii="Symbol" w:hAnsi="Symbol" w:hint="default"/>
+      </w:rPr>
+    </w:lvl>
+    <w:lvl w:ilvl="4" w:tplc="04100003" w:tentative="1">
+      <w:start w:val="1"/>
+      <w:numFmt w:val="bullet"/>
+      <w:lvlText w:val="o"/>
+      <w:lvlJc w:val="left"/>
+      <w:pPr>
+        <w:ind w:left="3600" w:hanging="360"/>
+      </w:pPr>
+      <w:rPr>
+        <w:rFonts w:ascii="Courier New" w:hAnsi="Courier New" w:cs="Courier New" w:hint="default"/>
+      </w:rPr>
+    </w:lvl>
+    <w:lvl w:ilvl="5" w:tplc="04100005" w:tentative="1">
+      <w:start w:val="1"/>
+      <w:numFmt w:val="bullet"/>
+      <w:lvlText w:val=""/>
+      <w:lvlJc w:val="left"/>
+      <w:pPr>
+        <w:ind w:left="4320" w:hanging="360"/>
+      </w:pPr>
+      <w:rPr>
+        <w:rFonts w:ascii="Wingdings" w:hAnsi="Wingdings" w:hint="default"/>
+      </w:rPr>
+    </w:lvl>
+    <w:lvl w:ilvl="6" w:tplc="04100001" w:tentative="1">
+      <w:start w:val="1"/>
+      <w:numFmt w:val="bullet"/>
+      <w:lvlText w:val=""/>
+      <w:lvlJc w:val="left"/>
+      <w:pPr>
+        <w:ind w:left="5040" w:hanging="360"/>
+      </w:pPr>
+      <w:rPr>
+        <w:rFonts w:ascii="Symbol" w:hAnsi="Symbol" w:hint="default"/>
+      </w:rPr>
+    </w:lvl>
+    <w:lvl w:ilvl="7" w:tplc="04100003" w:tentative="1">
+      <w:start w:val="1"/>
+      <w:numFmt w:val="bullet"/>
+      <w:lvlText w:val="o"/>
+      <w:lvlJc w:val="left"/>
+      <w:pPr>
+        <w:ind w:left="5760" w:hanging="360"/>
+      </w:pPr>
+      <w:rPr>
+        <w:rFonts w:ascii="Courier New" w:hAnsi="Courier New" w:cs="Courier New" w:hint="default"/>
+      </w:rPr>
+    </w:lvl>
+    <w:lvl w:ilvl="8" w:tplc="04100005" w:tentative="1">
+      <w:start w:val="1"/>
+      <w:numFmt w:val="bullet"/>
+      <w:lvlText w:val=""/>
+      <w:lvlJc w:val="left"/>
+      <w:pPr>
+        <w:ind w:left="6480" w:hanging="360"/>
+      </w:pPr>
+      <w:rPr>
+        <w:rFonts w:ascii="Wingdings" w:hAnsi="Wingdings" w:hint="default"/>
+      </w:rPr>
+    </w:lvl>
+  </w:abstractNum>
+  <w:abstractNum w:abstractNumId="14" w15:restartNumberingAfterBreak="0">
+    <w:nsid w:val="79591541"/>
+    <w:multiLevelType w:val="hybridMultilevel"/>
+    <w:tmpl w:val="2360634C"/>
+    <w:lvl w:ilvl="0" w:tplc="C1705B3E">
+      <w:start w:val="1"/>
+      <w:numFmt w:val="bullet"/>
+      <w:lvlText w:val="•"/>
+      <w:lvlJc w:val="left"/>
+      <w:pPr>
+        <w:ind w:left="720" w:hanging="360"/>
+      </w:pPr>
+      <w:rPr>
+        <w:rFonts w:ascii="Arial" w:eastAsia="Arial" w:hAnsi="Arial" w:cs="Arial"/>
+        <w:b w:val="0"/>
+        <w:i w:val="0"/>
+        <w:strike w:val="0"/>
+        <w:dstrike w:val="0"/>
+        <w:color w:val="000000"/>
+        <w:sz w:val="20"/>
+        <w:szCs w:val="20"/>
+        <w:u w:val="none" w:color="000000"/>
+        <w:bdr w:val="none" w:sz="0" w:space="0" w:color="auto"/>
+        <w:shd w:val="clear" w:color="auto" w:fill="auto"/>
+        <w:vertAlign w:val="baseline"/>
+      </w:rPr>
+    </w:lvl>
+    <w:lvl w:ilvl="1" w:tplc="04100003" w:tentative="1">
+      <w:start w:val="1"/>
+      <w:numFmt w:val="bullet"/>
+      <w:lvlText w:val="o"/>
+      <w:lvlJc w:val="left"/>
+      <w:pPr>
+        <w:ind w:left="1440" w:hanging="360"/>
+      </w:pPr>
+      <w:rPr>
+        <w:rFonts w:ascii="Courier New" w:hAnsi="Courier New" w:cs="Courier New" w:hint="default"/>
+      </w:rPr>
+    </w:lvl>
+    <w:lvl w:ilvl="2" w:tplc="04100005" w:tentative="1">
+      <w:start w:val="1"/>
+      <w:numFmt w:val="bullet"/>
+      <w:lvlText w:val=""/>
+      <w:lvlJc w:val="left"/>
+      <w:pPr>
+        <w:ind w:left="2160" w:hanging="360"/>
+      </w:pPr>
+      <w:rPr>
+        <w:rFonts w:ascii="Wingdings" w:hAnsi="Wingdings" w:hint="default"/>
+      </w:rPr>
+    </w:lvl>
+    <w:lvl w:ilvl="3" w:tplc="04100001" w:tentative="1">
+      <w:start w:val="1"/>
+      <w:numFmt w:val="bullet"/>
+      <w:lvlText w:val=""/>
+      <w:lvlJc w:val="left"/>
+      <w:pPr>
+        <w:ind w:left="2880" w:hanging="360"/>
+      </w:pPr>
+      <w:rPr>
+        <w:rFonts w:ascii="Symbol" w:hAnsi="Symbol" w:hint="default"/>
+      </w:rPr>
+    </w:lvl>
+    <w:lvl w:ilvl="4" w:tplc="04100003" w:tentative="1">
+      <w:start w:val="1"/>
+      <w:numFmt w:val="bullet"/>
+      <w:lvlText w:val="o"/>
+      <w:lvlJc w:val="left"/>
+      <w:pPr>
+        <w:ind w:left="3600" w:hanging="360"/>
+      </w:pPr>
+      <w:rPr>
+        <w:rFonts w:ascii="Courier New" w:hAnsi="Courier New" w:cs="Courier New" w:hint="default"/>
+      </w:rPr>
+    </w:lvl>
+    <w:lvl w:ilvl="5" w:tplc="04100005" w:tentative="1">
+      <w:start w:val="1"/>
+      <w:numFmt w:val="bullet"/>
+      <w:lvlText w:val=""/>
+      <w:lvlJc w:val="left"/>
+      <w:pPr>
+        <w:ind w:left="4320" w:hanging="360"/>
+      </w:pPr>
+      <w:rPr>
+        <w:rFonts w:ascii="Wingdings" w:hAnsi="Wingdings" w:hint="default"/>
+      </w:rPr>
+    </w:lvl>
+    <w:lvl w:ilvl="6" w:tplc="04100001" w:tentative="1">
+      <w:start w:val="1"/>
+      <w:numFmt w:val="bullet"/>
+      <w:lvlText w:val=""/>
+      <w:lvlJc w:val="left"/>
+      <w:pPr>
+        <w:ind w:left="5040" w:hanging="360"/>
+      </w:pPr>
+      <w:rPr>
+        <w:rFonts w:ascii="Symbol" w:hAnsi="Symbol" w:hint="default"/>
+      </w:rPr>
+    </w:lvl>
+    <w:lvl w:ilvl="7" w:tplc="04100003" w:tentative="1">
+      <w:start w:val="1"/>
+      <w:numFmt w:val="bullet"/>
+      <w:lvlText w:val="o"/>
+      <w:lvlJc w:val="left"/>
+      <w:pPr>
+        <w:ind w:left="5760" w:hanging="360"/>
+      </w:pPr>
+      <w:rPr>
+        <w:rFonts w:ascii="Courier New" w:hAnsi="Courier New" w:cs="Courier New" w:hint="default"/>
+      </w:rPr>
+    </w:lvl>
+    <w:lvl w:ilvl="8" w:tplc="04100005" w:tentative="1">
+      <w:start w:val="1"/>
+      <w:numFmt w:val="bullet"/>
+      <w:lvlText w:val=""/>
+      <w:lvlJc w:val="left"/>
+      <w:pPr>
+        <w:ind w:left="6480" w:hanging="360"/>
+      </w:pPr>
+      <w:rPr>
+        <w:rFonts w:ascii="Wingdings" w:hAnsi="Wingdings" w:hint="default"/>
+      </w:rPr>
+    </w:lvl>
+  </w:abstractNum>
+  <w:num w:numId="1">
+    <w:abstractNumId w:val="11"/>
+  </w:num>
+  <w:num w:numId="2">
+    <w:abstractNumId w:val="1"/>
+  </w:num>
+  <w:num w:numId="3">
+    <w:abstractNumId w:val="6"/>
+  </w:num>
+  <w:num w:numId="4">
+    <w:abstractNumId w:val="4"/>
+  </w:num>
+  <w:num w:numId="5">
     <w:abstractNumId w:val="10"/>
   </w:num>
-  <w:num w:numId="2" w16cid:durableId="1586068511">
-    <w:abstractNumId w:val="1"/>
+  <w:num w:numId="6">
+    <w:abstractNumId w:val="0"/>
   </w:num>
-  <w:num w:numId="3" w16cid:durableId="1144160105">
-    <w:abstractNumId w:val="6"/>
+  <w:num w:numId="7">
+    <w:abstractNumId w:val="2"/>
   </w:num>
-  <w:num w:numId="4" w16cid:durableId="1539128229">
-    <w:abstractNumId w:val="4"/>
-  </w:num>
-  <w:num w:numId="5" w16cid:durableId="791241118">
+  <w:num w:numId="8">
     <w:abstractNumId w:val="9"/>
   </w:num>
-  <w:num w:numId="6" w16cid:durableId="1293947695">
-    <w:abstractNumId w:val="0"/>
-  </w:num>
-  <w:num w:numId="7" w16cid:durableId="2027902475">
-    <w:abstractNumId w:val="2"/>
-  </w:num>
-  <w:num w:numId="8" w16cid:durableId="568224387">
+  <w:num w:numId="9">
     <w:abstractNumId w:val="8"/>
   </w:num>
-  <w:num w:numId="9" w16cid:durableId="836265301">
-    <w:abstractNumId w:val="7"/>
-  </w:num>
-  <w:num w:numId="10" w16cid:durableId="2047829226">
+  <w:num w:numId="10">
     <w:abstractNumId w:val="3"/>
   </w:num>
-  <w:num w:numId="11" w16cid:durableId="1868835569">
+  <w:num w:numId="11">
     <w:abstractNumId w:val="5"/>
+  </w:num>
+  <w:num w:numId="12">
+    <w:abstractNumId w:val="14"/>
+  </w:num>
+  <w:num w:numId="13">
+    <w:abstractNumId w:val="12"/>
+  </w:num>
+  <w:num w:numId="14">
+    <w:abstractNumId w:val="13"/>
+  </w:num>
+  <w:num w:numId="15">
+    <w:abstractNumId w:val="7"/>
   </w:num>
 </w:numbering>
 </file>
 
 <file path=word/styles.xml><?xml version="1.0" encoding="utf-8"?>
-<w:styles xmlns:mc="http://schemas.openxmlformats.org/markup-compatibility/2006" xmlns:r="http://schemas.openxmlformats.org/officeDocument/2006/relationships" xmlns:w="http://schemas.openxmlformats.org/wordprocessingml/2006/main" xmlns:w14="http://schemas.microsoft.com/office/word/2010/wordml" xmlns:w15="http://schemas.microsoft.com/office/word/2012/wordml" xmlns:w16cex="http://schemas.microsoft.com/office/word/2018/wordml/cex" xmlns:w16cid="http://schemas.microsoft.com/office/word/2016/wordml/cid" xmlns:w16="http://schemas.microsoft.com/office/word/2018/wordml" xmlns:w16du="http://schemas.microsoft.com/office/word/2023/wordml/word16du" xmlns:w16sdtdh="http://schemas.microsoft.com/office/word/2020/wordml/sdtdatahash" xmlns:w16sdtfl="http://schemas.microsoft.com/office/word/2024/wordml/sdtformatlock" xmlns:w16se="http://schemas.microsoft.com/office/word/2015/wordml/symex" mc:Ignorable="w14 w15 w16se w16cid w16 w16cex w16sdtdh w16sdtfl w16du">
+<w:styles xmlns:mc="http://schemas.openxmlformats.org/markup-compatibility/2006" xmlns:r="http://schemas.openxmlformats.org/officeDocument/2006/relationships" xmlns:w="http://schemas.openxmlformats.org/wordprocessingml/2006/main" xmlns:w14="http://schemas.microsoft.com/office/word/2010/wordml" xmlns:w15="http://schemas.microsoft.com/office/word/2012/wordml" xmlns:w16cex="http://schemas.microsoft.com/office/word/2018/wordml/cex" xmlns:w16cid="http://schemas.microsoft.com/office/word/2016/wordml/cid" xmlns:w16="http://schemas.microsoft.com/office/word/2018/wordml" xmlns:w16sdtdh="http://schemas.microsoft.com/office/word/2020/wordml/sdtdatahash" xmlns:w16se="http://schemas.microsoft.com/office/word/2015/wordml/symex" mc:Ignorable="w14 w15 w16se w16cid w16 w16cex w16sdtdh">
   <w:docDefaults>
     <w:rPrDefault>
       <w:rPr>
@@ -7308,6 +8109,7 @@
   <w:style w:type="paragraph" w:styleId="Sommario1">
     <w:name w:val="toc 1"/>
     <w:hidden/>
+    <w:uiPriority w:val="39"/>
     <w:pPr>
       <w:spacing w:after="43" w:line="248" w:lineRule="auto"/>
       <w:ind w:left="15" w:right="102"/>
@@ -7330,6 +8132,28 @@
         <w:right w:w="0" w:type="dxa"/>
       </w:tblCellMar>
     </w:tblPr>
+  </w:style>
+  <w:style w:type="paragraph" w:styleId="Paragrafoelenco">
+    <w:name w:val="List Paragraph"/>
+    <w:basedOn w:val="Normale"/>
+    <w:uiPriority w:val="34"/>
+    <w:qFormat/>
+    <w:rsid w:val="007F115C"/>
+    <w:pPr>
+      <w:ind w:left="720"/>
+      <w:contextualSpacing/>
+    </w:pPr>
+  </w:style>
+  <w:style w:type="character" w:styleId="Collegamentoipertestuale">
+    <w:name w:val="Hyperlink"/>
+    <w:basedOn w:val="Carpredefinitoparagrafo"/>
+    <w:uiPriority w:val="99"/>
+    <w:unhideWhenUsed/>
+    <w:rsid w:val="003A7B4C"/>
+    <w:rPr>
+      <w:color w:val="467886" w:themeColor="hyperlink"/>
+      <w:u w:val="single"/>
+    </w:rPr>
   </w:style>
 </w:styles>
 </file>

</xml_diff>